<commit_message>
Fim aula - 04/03 - na proxima aula faremos comparacoes de tempo de execucao entre as buscas binaria e linear.
</commit_message>
<xml_diff>
--- a/t1-sub1-lab/semana04 - buscaBinaria/Apostila - BuscaLinears&BuscaBinaria.docx
+++ b/t1-sub1-lab/semana04 - buscaBinaria/Apostila - BuscaLinears&BuscaBinaria.docx
@@ -169,16 +169,7 @@
           <w:sz w:val="26"/>
           <w:szCs w:val="26"/>
         </w:rPr>
-        <w:t xml:space="preserve"> até que o elemento desejado seja encontrado ou até que tod</w:t>
-      </w:r>
-      <w:r>
-        <w:rPr>
-          <w:rFonts w:ascii="Arial" w:eastAsia="Arial" w:hAnsi="Arial" w:cs="Arial"/>
-          <w:color w:val="000000"/>
-          <w:sz w:val="26"/>
-          <w:szCs w:val="26"/>
-        </w:rPr>
-        <w:t>os os elementos tenham sido examinados.</w:t>
+        <w:t xml:space="preserve"> até que o elemento desejado seja encontrado ou até que todos os elementos tenham sido examinados.</w:t>
       </w:r>
     </w:p>
     <w:p>
@@ -242,15 +233,7 @@
           <w:sz w:val="26"/>
           <w:szCs w:val="26"/>
         </w:rPr>
-        <w:t>)</w:t>
-      </w:r>
-      <w:r>
-        <w:rPr>
-          <w:rFonts w:ascii="Arial" w:hAnsi="Arial" w:cs="Arial"/>
-          <w:sz w:val="26"/>
-          <w:szCs w:val="26"/>
-        </w:rPr>
-        <w:t xml:space="preserve"> no pior caso. Isso significa que, se o vetor possuir</w:t>
+        <w:t>) no pior caso. Isso significa que, se o vetor possuir</w:t>
       </w:r>
       <w:r>
         <w:rPr>
@@ -268,17 +251,7 @@
           <w:sz w:val="26"/>
           <w:szCs w:val="26"/>
         </w:rPr>
-        <w:t>n</w:t>
-      </w:r>
-      <w:r>
-        <w:rPr>
-          <w:rFonts w:ascii="Arial" w:hAnsi="Arial" w:cs="Arial"/>
-          <w:b/>
-          <w:bCs/>
-          <w:sz w:val="26"/>
-          <w:szCs w:val="26"/>
-        </w:rPr>
-        <w:t xml:space="preserve"> </w:t>
+        <w:t xml:space="preserve">n </w:t>
       </w:r>
       <w:r>
         <w:rPr>
@@ -1092,16 +1065,7 @@
                 <w:sz w:val="24"/>
                 <w:szCs w:val="24"/>
               </w:rPr>
-              <w:t> </w:t>
-            </w:r>
-            <w:r>
-              <w:rPr>
-                <w:rFonts w:ascii="Consolas" w:eastAsia="Consolas" w:hAnsi="Consolas" w:cs="Consolas"/>
-                <w:color w:val="000000"/>
-                <w:sz w:val="24"/>
-                <w:szCs w:val="24"/>
-              </w:rPr>
-              <w:t xml:space="preserve">   </w:t>
+              <w:t xml:space="preserve">    </w:t>
             </w:r>
             <w:proofErr w:type="spellStart"/>
             <w:r>
@@ -1735,6 +1699,7 @@
               <w:rPr>
                 <w:rFonts w:ascii="Consolas" w:eastAsia="Consolas" w:hAnsi="Consolas" w:cs="Consolas"/>
                 <w:color w:val="000000"/>
+                <w:lang w:val="en-US"/>
               </w:rPr>
               <w:t xml:space="preserve">        </w:t>
             </w:r>
@@ -1759,14 +1724,7 @@
                 <w:rFonts w:ascii="Consolas" w:eastAsia="Consolas" w:hAnsi="Consolas" w:cs="Consolas"/>
                 <w:color w:val="000000"/>
               </w:rPr>
-              <w:t xml:space="preserve"> v</w:t>
-            </w:r>
-            <w:r>
-              <w:rPr>
-                <w:rFonts w:ascii="Consolas" w:eastAsia="Consolas" w:hAnsi="Consolas" w:cs="Consolas"/>
-                <w:color w:val="000000"/>
-              </w:rPr>
-              <w:t xml:space="preserve"> = </w:t>
+              <w:t xml:space="preserve"> v = </w:t>
             </w:r>
             <w:r>
               <w:rPr>
@@ -1859,14 +1817,7 @@
                 <w:rFonts w:ascii="Consolas" w:eastAsia="Consolas" w:hAnsi="Consolas" w:cs="Consolas"/>
                 <w:color w:val="000000"/>
               </w:rPr>
-              <w:t>v</w:t>
-            </w:r>
-            <w:r>
-              <w:rPr>
-                <w:rFonts w:ascii="Consolas" w:eastAsia="Consolas" w:hAnsi="Consolas" w:cs="Consolas"/>
-                <w:color w:val="000000"/>
-              </w:rPr>
-              <w:t>.preencheVetor</w:t>
+              <w:t>v.preencheVetor</w:t>
             </w:r>
             <w:proofErr w:type="spellEnd"/>
             <w:r>
@@ -1910,15 +1861,7 @@
                 <w:color w:val="000000"/>
                 <w:lang w:val="en-US"/>
               </w:rPr>
-              <w:t>(v</w:t>
-            </w:r>
-            <w:r>
-              <w:rPr>
-                <w:rFonts w:ascii="Consolas" w:eastAsia="Consolas" w:hAnsi="Consolas" w:cs="Consolas"/>
-                <w:color w:val="000000"/>
-                <w:lang w:val="en-US"/>
-              </w:rPr>
-              <w:t>);</w:t>
+              <w:t>(v);</w:t>
             </w:r>
           </w:p>
           <w:p>
@@ -2014,6 +1957,7 @@
               <w:rPr>
                 <w:rFonts w:ascii="Consolas" w:eastAsia="Consolas" w:hAnsi="Consolas" w:cs="Consolas"/>
                 <w:color w:val="000000"/>
+                <w:lang w:val="en-US"/>
               </w:rPr>
               <w:t xml:space="preserve">        </w:t>
             </w:r>
@@ -2195,14 +2139,7 @@
                 <w:rFonts w:ascii="Consolas" w:eastAsia="Consolas" w:hAnsi="Consolas" w:cs="Consolas"/>
                 <w:color w:val="000000"/>
               </w:rPr>
-              <w:t>v</w:t>
-            </w:r>
-            <w:r>
-              <w:rPr>
-                <w:rFonts w:ascii="Consolas" w:eastAsia="Consolas" w:hAnsi="Consolas" w:cs="Consolas"/>
-                <w:color w:val="000000"/>
-              </w:rPr>
-              <w:t>.busca</w:t>
+              <w:t>v.busca</w:t>
             </w:r>
             <w:r>
               <w:rPr>
@@ -2917,15 +2854,7 @@
           <w:sz w:val="26"/>
           <w:szCs w:val="26"/>
         </w:rPr>
-        <w:t xml:space="preserve">Como o vetor é sucessivamente dividido por 2, o algoritmo atinge uma complexidade de tempo logarítmica </w:t>
-      </w:r>
-      <w:r>
-        <w:rPr>
-          <w:rFonts w:ascii="Arial" w:eastAsia="Times New Roman" w:hAnsi="Arial" w:cs="Arial"/>
-          <w:sz w:val="26"/>
-          <w:szCs w:val="26"/>
-        </w:rPr>
-        <w:t>(</w:t>
+        <w:t>Como o vetor é sucessivamente dividido por 2, o algoritmo atinge uma complexidade de tempo logarítmica (</w:t>
       </w:r>
       <w:r>
         <w:rPr>
@@ -2935,23 +2864,35 @@
           <w:sz w:val="26"/>
           <w:szCs w:val="26"/>
         </w:rPr>
-        <w:t>O(log n)</w:t>
+        <w:t>O(log</w:t>
       </w:r>
       <w:r>
         <w:rPr>
           <w:rFonts w:ascii="Arial" w:eastAsia="Times New Roman" w:hAnsi="Arial" w:cs="Arial"/>
-          <w:sz w:val="26"/>
-          <w:szCs w:val="26"/>
-        </w:rPr>
-        <w:t>)</w:t>
+          <w:b/>
+          <w:bCs/>
+          <w:sz w:val="26"/>
+          <w:szCs w:val="26"/>
+        </w:rPr>
+        <w:t xml:space="preserve"> </w:t>
       </w:r>
       <w:r>
         <w:rPr>
           <w:rFonts w:ascii="Arial" w:eastAsia="Times New Roman" w:hAnsi="Arial" w:cs="Arial"/>
-          <w:sz w:val="26"/>
-          <w:szCs w:val="26"/>
-        </w:rPr>
-        <w:t xml:space="preserve">, o que o torna extremamente eficiente mesmo para </w:t>
+          <w:b/>
+          <w:bCs/>
+          <w:sz w:val="26"/>
+          <w:szCs w:val="26"/>
+        </w:rPr>
+        <w:t>n)</w:t>
+      </w:r>
+      <w:r>
+        <w:rPr>
+          <w:rFonts w:ascii="Arial" w:eastAsia="Times New Roman" w:hAnsi="Arial" w:cs="Arial"/>
+          <w:sz w:val="26"/>
+          <w:szCs w:val="26"/>
+        </w:rPr>
+        <w:t xml:space="preserve">), o que o torna extremamente eficiente mesmo para </w:t>
       </w:r>
       <w:r>
         <w:rPr>
@@ -3005,6 +2946,14 @@
           <w:szCs w:val="26"/>
         </w:rPr>
         <w:t xml:space="preserve"> ilustra o passo inicial do algoritmo: a seleção do elemento central do vetor.</w:t>
+      </w:r>
+      <w:r>
+        <w:rPr>
+          <w:rFonts w:ascii="Arial" w:hAnsi="Arial" w:cs="Arial"/>
+          <w:sz w:val="26"/>
+          <w:szCs w:val="26"/>
+        </w:rPr>
+        <w:t xml:space="preserve"> Note que o índice do elemento do meio é dado pela divisão por 2 da soma do primeiro e último índice.</w:t>
       </w:r>
     </w:p>
     <w:p>
@@ -3048,6 +2997,7 @@
       <w:r>
         <w:rPr>
           <w:rFonts w:ascii="Arial" w:eastAsia="Arial" w:hAnsi="Arial" w:cs="Arial"/>
+          <w:noProof/>
           <w:color w:val="000000"/>
           <w:sz w:val="26"/>
           <w:szCs w:val="26"/>
@@ -3195,20 +3145,20 @@
       <w:r>
         <w:rPr>
           <w:rFonts w:ascii="Arial" w:hAnsi="Arial" w:cs="Arial"/>
-          <w:i/>
-          <w:iCs/>
-          <w:sz w:val="26"/>
-          <w:szCs w:val="26"/>
-        </w:rPr>
-        <w:t>igual</w:t>
-      </w:r>
-      <w:r>
-        <w:rPr>
-          <w:rFonts w:ascii="Arial" w:hAnsi="Arial" w:cs="Arial"/>
-          <w:sz w:val="26"/>
-          <w:szCs w:val="26"/>
-        </w:rPr>
-        <w:t xml:space="preserve"> ao valor pesquisado, sua posição é retornada e o </w:t>
+          <w:b/>
+          <w:bCs/>
+          <w:sz w:val="26"/>
+          <w:szCs w:val="26"/>
+        </w:rPr>
+        <w:t xml:space="preserve">igual </w:t>
+      </w:r>
+      <w:r>
+        <w:rPr>
+          <w:rFonts w:ascii="Arial" w:hAnsi="Arial" w:cs="Arial"/>
+          <w:sz w:val="26"/>
+          <w:szCs w:val="26"/>
+        </w:rPr>
+        <w:t xml:space="preserve">ao valor pesquisado, sua posição é retornada e o </w:t>
       </w:r>
       <w:r>
         <w:rPr>
@@ -3269,7 +3219,27 @@
           <w:sz w:val="26"/>
           <w:szCs w:val="26"/>
         </w:rPr>
-        <w:t xml:space="preserve"> 2 (Valor está à esquerda):</w:t>
+        <w:t xml:space="preserve"> 2 (Valor está à </w:t>
+      </w:r>
+      <w:r>
+        <w:rPr>
+          <w:rFonts w:ascii="Arial" w:hAnsi="Arial" w:cs="Arial"/>
+          <w:b/>
+          <w:bCs/>
+          <w:sz w:val="26"/>
+          <w:szCs w:val="26"/>
+        </w:rPr>
+        <w:t>direita</w:t>
+      </w:r>
+      <w:r>
+        <w:rPr>
+          <w:rFonts w:ascii="Arial" w:hAnsi="Arial" w:cs="Arial"/>
+          <w:b/>
+          <w:bCs/>
+          <w:sz w:val="26"/>
+          <w:szCs w:val="26"/>
+        </w:rPr>
+        <w:t>):</w:t>
       </w:r>
       <w:r>
         <w:rPr>
@@ -3282,20 +3252,90 @@
       <w:r>
         <w:rPr>
           <w:rFonts w:ascii="Arial" w:hAnsi="Arial" w:cs="Arial"/>
+          <w:b/>
+          <w:bCs/>
           <w:i/>
           <w:iCs/>
           <w:sz w:val="26"/>
           <w:szCs w:val="26"/>
         </w:rPr>
-        <w:t>menor</w:t>
-      </w:r>
-      <w:r>
-        <w:rPr>
-          <w:rFonts w:ascii="Arial" w:hAnsi="Arial" w:cs="Arial"/>
-          <w:sz w:val="26"/>
-          <w:szCs w:val="26"/>
-        </w:rPr>
-        <w:t xml:space="preserve"> que o elemento central, descartamos toda a metade direita do vetor</w:t>
+        <w:t>m</w:t>
+      </w:r>
+      <w:r>
+        <w:rPr>
+          <w:rFonts w:ascii="Arial" w:hAnsi="Arial" w:cs="Arial"/>
+          <w:b/>
+          <w:bCs/>
+          <w:i/>
+          <w:iCs/>
+          <w:sz w:val="26"/>
+          <w:szCs w:val="26"/>
+        </w:rPr>
+        <w:t>aior</w:t>
+      </w:r>
+      <w:r>
+        <w:rPr>
+          <w:rFonts w:ascii="Arial" w:hAnsi="Arial" w:cs="Arial"/>
+          <w:sz w:val="26"/>
+          <w:szCs w:val="26"/>
+        </w:rPr>
+        <w:t xml:space="preserve"> que o elemento central, descartamos toda a metade </w:t>
+      </w:r>
+      <w:r>
+        <w:rPr>
+          <w:rFonts w:ascii="Arial" w:hAnsi="Arial" w:cs="Arial"/>
+          <w:sz w:val="26"/>
+          <w:szCs w:val="26"/>
+        </w:rPr>
+        <w:t>esquerda</w:t>
+      </w:r>
+      <w:r>
+        <w:rPr>
+          <w:rFonts w:ascii="Arial" w:hAnsi="Arial" w:cs="Arial"/>
+          <w:sz w:val="26"/>
+          <w:szCs w:val="26"/>
+        </w:rPr>
+        <w:t xml:space="preserve"> do vetor</w:t>
+      </w:r>
+      <w:r>
+        <w:rPr>
+          <w:rFonts w:ascii="Arial" w:hAnsi="Arial" w:cs="Arial"/>
+          <w:sz w:val="26"/>
+          <w:szCs w:val="26"/>
+        </w:rPr>
+        <w:t xml:space="preserve"> (números </w:t>
+      </w:r>
+      <w:r>
+        <w:rPr>
+          <w:rFonts w:ascii="Arial" w:hAnsi="Arial" w:cs="Arial"/>
+          <w:sz w:val="26"/>
+          <w:szCs w:val="26"/>
+        </w:rPr>
+        <w:t>menores</w:t>
+      </w:r>
+      <w:r>
+        <w:rPr>
+          <w:rFonts w:ascii="Arial" w:hAnsi="Arial" w:cs="Arial"/>
+          <w:sz w:val="26"/>
+          <w:szCs w:val="26"/>
+        </w:rPr>
+        <w:t xml:space="preserve"> que o elemento central)</w:t>
+      </w:r>
+      <w:r>
+        <w:rPr>
+          <w:rFonts w:ascii="Arial" w:hAnsi="Arial" w:cs="Arial"/>
+          <w:sz w:val="26"/>
+          <w:szCs w:val="26"/>
+        </w:rPr>
+        <w:t xml:space="preserve">. A pesquisa continua apenas na metade </w:t>
+      </w:r>
+      <w:r>
+        <w:rPr>
+          <w:rFonts w:ascii="Arial" w:hAnsi="Arial" w:cs="Arial"/>
+          <w:sz w:val="26"/>
+          <w:szCs w:val="26"/>
+        </w:rPr>
+        <w:t>direita</w:t>
       </w:r>
       <w:r>
         <w:rPr>
@@ -3311,7 +3351,39 @@
           <w:sz w:val="26"/>
           <w:szCs w:val="26"/>
         </w:rPr>
-        <w:t>. A pesquisa continua apenas na metade esquerda. Para isso, o limite final da busca é ajustado para a posição imediatamente anterior ao centro (</w:t>
+        <w:t xml:space="preserve">. Para isso, o </w:t>
+      </w:r>
+      <w:r>
+        <w:rPr>
+          <w:rFonts w:ascii="Arial" w:hAnsi="Arial" w:cs="Arial"/>
+          <w:sz w:val="26"/>
+          <w:szCs w:val="26"/>
+        </w:rPr>
+        <w:t>índice inicial</w:t>
+      </w:r>
+      <w:r>
+        <w:rPr>
+          <w:rFonts w:ascii="Arial" w:hAnsi="Arial" w:cs="Arial"/>
+          <w:sz w:val="26"/>
+          <w:szCs w:val="26"/>
+        </w:rPr>
+        <w:t xml:space="preserve"> da busca é ajustado para a posição imediatamente a</w:t>
+      </w:r>
+      <w:r>
+        <w:rPr>
+          <w:rFonts w:ascii="Arial" w:hAnsi="Arial" w:cs="Arial"/>
+          <w:sz w:val="26"/>
+          <w:szCs w:val="26"/>
+        </w:rPr>
+        <w:t>pós o</w:t>
+      </w:r>
+      <w:r>
+        <w:rPr>
+          <w:rFonts w:ascii="Arial" w:hAnsi="Arial" w:cs="Arial"/>
+          <w:sz w:val="26"/>
+          <w:szCs w:val="26"/>
+        </w:rPr>
+        <w:t xml:space="preserve"> centro (</w:t>
       </w:r>
       <w:proofErr w:type="spellStart"/>
       <w:r>
@@ -3321,7 +3393,7 @@
           <w:sz w:val="26"/>
           <w:szCs w:val="26"/>
         </w:rPr>
-        <w:t>nova_posicao</w:t>
+        <w:t>primeiro_indice</w:t>
       </w:r>
       <w:proofErr w:type="spellEnd"/>
       <w:r>
@@ -3341,7 +3413,16 @@
           <w:sz w:val="26"/>
           <w:szCs w:val="26"/>
         </w:rPr>
-        <w:t>indice_central</w:t>
+        <w:t>indice_</w:t>
+      </w:r>
+      <w:r>
+        <w:rPr>
+          <w:rStyle w:val="CdigoHTML"/>
+          <w:rFonts w:ascii="Arial" w:hAnsi="Arial" w:cs="Arial"/>
+          <w:sz w:val="26"/>
+          <w:szCs w:val="26"/>
+        </w:rPr>
+        <w:t>central</w:t>
       </w:r>
       <w:proofErr w:type="spellEnd"/>
       <w:r>
@@ -3351,7 +3432,25 @@
           <w:sz w:val="26"/>
           <w:szCs w:val="26"/>
         </w:rPr>
-        <w:t xml:space="preserve"> - 1</w:t>
+        <w:t xml:space="preserve"> </w:t>
+      </w:r>
+      <w:r>
+        <w:rPr>
+          <w:rStyle w:val="CdigoHTML"/>
+          <w:rFonts w:ascii="Arial" w:hAnsi="Arial" w:cs="Arial"/>
+          <w:sz w:val="26"/>
+          <w:szCs w:val="26"/>
+        </w:rPr>
+        <w:t>+</w:t>
+      </w:r>
+      <w:r>
+        <w:rPr>
+          <w:rStyle w:val="CdigoHTML"/>
+          <w:rFonts w:ascii="Arial" w:hAnsi="Arial" w:cs="Arial"/>
+          <w:sz w:val="26"/>
+          <w:szCs w:val="26"/>
+        </w:rPr>
+        <w:t xml:space="preserve"> 1</w:t>
       </w:r>
       <w:r>
         <w:rPr>
@@ -3384,33 +3483,97 @@
           <w:sz w:val="26"/>
           <w:szCs w:val="26"/>
         </w:rPr>
-        <w:t>Cenário 3 (Valor está à direita):</w:t>
-      </w:r>
-      <w:r>
-        <w:rPr>
-          <w:rFonts w:ascii="Arial" w:hAnsi="Arial" w:cs="Arial"/>
-          <w:sz w:val="26"/>
-          <w:szCs w:val="26"/>
-        </w:rPr>
-        <w:t xml:space="preserve"> Se o valor pesquisado for </w:t>
-      </w:r>
-      <w:r>
-        <w:rPr>
-          <w:rFonts w:ascii="Arial" w:hAnsi="Arial" w:cs="Arial"/>
+        <w:t xml:space="preserve">Cenário 3 (Valor está à </w:t>
+      </w:r>
+      <w:r>
+        <w:rPr>
+          <w:rFonts w:ascii="Arial" w:hAnsi="Arial" w:cs="Arial"/>
+          <w:b/>
+          <w:bCs/>
+          <w:sz w:val="26"/>
+          <w:szCs w:val="26"/>
+        </w:rPr>
+        <w:t>esquerda</w:t>
+      </w:r>
+      <w:r>
+        <w:rPr>
+          <w:rFonts w:ascii="Arial" w:hAnsi="Arial" w:cs="Arial"/>
+          <w:b/>
+          <w:bCs/>
+          <w:sz w:val="26"/>
+          <w:szCs w:val="26"/>
+        </w:rPr>
+        <w:t>):</w:t>
+      </w:r>
+      <w:r>
+        <w:rPr>
+          <w:rFonts w:ascii="Arial" w:hAnsi="Arial" w:cs="Arial"/>
+          <w:sz w:val="26"/>
+          <w:szCs w:val="26"/>
+        </w:rPr>
+        <w:t xml:space="preserve"> Se o valor pesquisado for</w:t>
+      </w:r>
+      <w:r>
+        <w:rPr>
+          <w:rFonts w:ascii="Arial" w:hAnsi="Arial" w:cs="Arial"/>
+          <w:sz w:val="26"/>
+          <w:szCs w:val="26"/>
+        </w:rPr>
+        <w:t xml:space="preserve"> </w:t>
+      </w:r>
+      <w:r>
+        <w:rPr>
+          <w:rFonts w:ascii="Arial" w:hAnsi="Arial" w:cs="Arial"/>
+          <w:b/>
+          <w:bCs/>
           <w:i/>
           <w:iCs/>
           <w:sz w:val="26"/>
           <w:szCs w:val="26"/>
         </w:rPr>
-        <w:t>maior</w:t>
-      </w:r>
-      <w:r>
-        <w:rPr>
-          <w:rFonts w:ascii="Arial" w:hAnsi="Arial" w:cs="Arial"/>
-          <w:sz w:val="26"/>
-          <w:szCs w:val="26"/>
-        </w:rPr>
-        <w:t xml:space="preserve"> que o elemento central, a lógica é análoga ao </w:t>
+        <w:t>m</w:t>
+      </w:r>
+      <w:r>
+        <w:rPr>
+          <w:rFonts w:ascii="Arial" w:hAnsi="Arial" w:cs="Arial"/>
+          <w:b/>
+          <w:bCs/>
+          <w:i/>
+          <w:iCs/>
+          <w:sz w:val="26"/>
+          <w:szCs w:val="26"/>
+        </w:rPr>
+        <w:t>eno</w:t>
+      </w:r>
+      <w:r>
+        <w:rPr>
+          <w:rFonts w:ascii="Arial" w:hAnsi="Arial" w:cs="Arial"/>
+          <w:b/>
+          <w:bCs/>
+          <w:i/>
+          <w:iCs/>
+          <w:sz w:val="26"/>
+          <w:szCs w:val="26"/>
+        </w:rPr>
+        <w:t>r</w:t>
+      </w:r>
+      <w:r>
+        <w:rPr>
+          <w:rFonts w:ascii="Arial" w:hAnsi="Arial" w:cs="Arial"/>
+          <w:i/>
+          <w:iCs/>
+          <w:sz w:val="26"/>
+          <w:szCs w:val="26"/>
+        </w:rPr>
+        <w:t xml:space="preserve"> </w:t>
+      </w:r>
+      <w:r>
+        <w:rPr>
+          <w:rFonts w:ascii="Arial" w:hAnsi="Arial" w:cs="Arial"/>
+          <w:sz w:val="26"/>
+          <w:szCs w:val="26"/>
+        </w:rPr>
+        <w:t xml:space="preserve">que o elemento central, a lógica é análoga ao </w:t>
       </w:r>
       <w:r>
         <w:rPr>
@@ -3436,15 +3599,79 @@
           <w:sz w:val="26"/>
           <w:szCs w:val="26"/>
         </w:rPr>
-        <w:t xml:space="preserve"> porém descartamos toda a metade esquerda (números menores do que o elemento central) e ficamos somente com a metade direita.</w:t>
-      </w:r>
-      <w:r>
-        <w:rPr>
-          <w:rFonts w:ascii="Arial" w:hAnsi="Arial" w:cs="Arial"/>
-          <w:sz w:val="26"/>
-          <w:szCs w:val="26"/>
-        </w:rPr>
-        <w:t xml:space="preserve"> Neste cenário, o limite final da busca é ajustado para a posição imediatamente após o centro (</w:t>
+        <w:t xml:space="preserve"> porém descartamos toda a metade </w:t>
+      </w:r>
+      <w:r>
+        <w:rPr>
+          <w:rFonts w:ascii="Arial" w:hAnsi="Arial" w:cs="Arial"/>
+          <w:sz w:val="26"/>
+          <w:szCs w:val="26"/>
+        </w:rPr>
+        <w:t>direita</w:t>
+      </w:r>
+      <w:r>
+        <w:rPr>
+          <w:rFonts w:ascii="Arial" w:hAnsi="Arial" w:cs="Arial"/>
+          <w:sz w:val="26"/>
+          <w:szCs w:val="26"/>
+        </w:rPr>
+        <w:t xml:space="preserve"> e ficamos somente com a metade </w:t>
+      </w:r>
+      <w:r>
+        <w:rPr>
+          <w:rFonts w:ascii="Arial" w:hAnsi="Arial" w:cs="Arial"/>
+          <w:sz w:val="26"/>
+          <w:szCs w:val="26"/>
+        </w:rPr>
+        <w:t>esquerda</w:t>
+      </w:r>
+      <w:r>
+        <w:rPr>
+          <w:rFonts w:ascii="Arial" w:hAnsi="Arial" w:cs="Arial"/>
+          <w:sz w:val="26"/>
+          <w:szCs w:val="26"/>
+        </w:rPr>
+        <w:t>.</w:t>
+      </w:r>
+      <w:r>
+        <w:rPr>
+          <w:rFonts w:ascii="Arial" w:hAnsi="Arial" w:cs="Arial"/>
+          <w:sz w:val="26"/>
+          <w:szCs w:val="26"/>
+        </w:rPr>
+        <w:t xml:space="preserve"> Neste cenário, o limite </w:t>
+      </w:r>
+      <w:r>
+        <w:rPr>
+          <w:rFonts w:ascii="Arial" w:hAnsi="Arial" w:cs="Arial"/>
+          <w:sz w:val="26"/>
+          <w:szCs w:val="26"/>
+        </w:rPr>
+        <w:t xml:space="preserve">final </w:t>
+      </w:r>
+      <w:r>
+        <w:rPr>
+          <w:rFonts w:ascii="Arial" w:hAnsi="Arial" w:cs="Arial"/>
+          <w:sz w:val="26"/>
+          <w:szCs w:val="26"/>
+        </w:rPr>
+        <w:t xml:space="preserve">da busca é ajustado para a posição imediatamente </w:t>
+      </w:r>
+      <w:r>
+        <w:rPr>
+          <w:rFonts w:ascii="Arial" w:hAnsi="Arial" w:cs="Arial"/>
+          <w:sz w:val="26"/>
+          <w:szCs w:val="26"/>
+        </w:rPr>
+        <w:t>anterior a</w:t>
+      </w:r>
+      <w:r>
+        <w:rPr>
+          <w:rFonts w:ascii="Arial" w:hAnsi="Arial" w:cs="Arial"/>
+          <w:sz w:val="26"/>
+          <w:szCs w:val="26"/>
+        </w:rPr>
+        <w:t>o centro (</w:t>
       </w:r>
       <w:proofErr w:type="spellStart"/>
       <w:r>
@@ -3453,7 +3680,7 @@
           <w:sz w:val="26"/>
           <w:szCs w:val="26"/>
         </w:rPr>
-        <w:t>nova_posicao</w:t>
+        <w:t>ultimo_indice</w:t>
       </w:r>
       <w:proofErr w:type="spellEnd"/>
       <w:r>
@@ -3462,7 +3689,15 @@
           <w:sz w:val="26"/>
           <w:szCs w:val="26"/>
         </w:rPr>
-        <w:t xml:space="preserve"> = </w:t>
+        <w:t xml:space="preserve"> </w:t>
+      </w:r>
+      <w:r>
+        <w:rPr>
+          <w:rFonts w:ascii="Arial" w:hAnsi="Arial" w:cs="Arial"/>
+          <w:sz w:val="26"/>
+          <w:szCs w:val="26"/>
+        </w:rPr>
+        <w:t xml:space="preserve">= </w:t>
       </w:r>
       <w:proofErr w:type="spellStart"/>
       <w:r>
@@ -3480,7 +3715,23 @@
           <w:sz w:val="26"/>
           <w:szCs w:val="26"/>
         </w:rPr>
-        <w:t xml:space="preserve"> + 1).</w:t>
+        <w:t xml:space="preserve"> </w:t>
+      </w:r>
+      <w:r>
+        <w:rPr>
+          <w:rFonts w:ascii="Arial" w:hAnsi="Arial" w:cs="Arial"/>
+          <w:sz w:val="26"/>
+          <w:szCs w:val="26"/>
+        </w:rPr>
+        <w:t>-</w:t>
+      </w:r>
+      <w:r>
+        <w:rPr>
+          <w:rFonts w:ascii="Arial" w:hAnsi="Arial" w:cs="Arial"/>
+          <w:sz w:val="26"/>
+          <w:szCs w:val="26"/>
+        </w:rPr>
+        <w:t xml:space="preserve"> 1).</w:t>
       </w:r>
     </w:p>
     <w:p>
@@ -3609,17 +3860,6 @@
         </w:rPr>
         <w:t>o elemento central é recalculado.</w:t>
       </w:r>
-    </w:p>
-    <w:p>
-      <w:pPr>
-        <w:pStyle w:val="NormalWeb"/>
-        <w:jc w:val="both"/>
-        <w:rPr>
-          <w:rFonts w:ascii="Arial" w:hAnsi="Arial" w:cs="Arial"/>
-          <w:sz w:val="26"/>
-          <w:szCs w:val="26"/>
-        </w:rPr>
-      </w:pPr>
     </w:p>
     <w:p>
       <w:pPr>
@@ -3773,7 +4013,46 @@
           <w:sz w:val="26"/>
           <w:szCs w:val="26"/>
         </w:rPr>
-        <w:t>os limites da busca se cruzam (isto é, quando o índice de "início" se torna maior que o índice de "fim"). Isso indica matematicamente que a área de pesquisa foi reduzida a zero e o elemento não existe no vetor.</w:t>
+        <w:t xml:space="preserve">os limites da busca se cruzam (isto é, quando o </w:t>
+      </w:r>
+      <w:r>
+        <w:rPr>
+          <w:rFonts w:ascii="Arial" w:hAnsi="Arial" w:cs="Arial"/>
+          <w:b/>
+          <w:bCs/>
+          <w:sz w:val="26"/>
+          <w:szCs w:val="26"/>
+        </w:rPr>
+        <w:t xml:space="preserve">índice de "início" se torna </w:t>
+      </w:r>
+      <w:r>
+        <w:rPr>
+          <w:rFonts w:ascii="Arial" w:hAnsi="Arial" w:cs="Arial"/>
+          <w:b/>
+          <w:bCs/>
+          <w:sz w:val="26"/>
+          <w:szCs w:val="26"/>
+          <w:u w:val="single"/>
+        </w:rPr>
+        <w:t>maior</w:t>
+      </w:r>
+      <w:r>
+        <w:rPr>
+          <w:rFonts w:ascii="Arial" w:hAnsi="Arial" w:cs="Arial"/>
+          <w:b/>
+          <w:bCs/>
+          <w:sz w:val="26"/>
+          <w:szCs w:val="26"/>
+        </w:rPr>
+        <w:t xml:space="preserve"> que o índice de "fim"</w:t>
+      </w:r>
+      <w:r>
+        <w:rPr>
+          <w:rFonts w:ascii="Arial" w:hAnsi="Arial" w:cs="Arial"/>
+          <w:sz w:val="26"/>
+          <w:szCs w:val="26"/>
+        </w:rPr>
+        <w:t>). Isso indica matematicamente que a área de pesquisa foi reduzida a zero e o elemento não existe no vetor.</w:t>
       </w:r>
     </w:p>
     <w:p>
@@ -3959,7 +4238,7 @@
       </w:tblGrid>
       <w:tr>
         <w:trPr>
-          <w:trHeight w:val="1865"/>
+          <w:trHeight w:val="1014"/>
         </w:trPr>
         <w:tc>
           <w:tcPr>
@@ -4119,7 +4398,7 @@
                 <w:rFonts w:ascii="Consolas" w:eastAsia="Consolas" w:hAnsi="Consolas" w:cs="Consolas"/>
                 <w:color w:val="000000"/>
               </w:rPr>
-              <w:t>ultimaPos</w:t>
+              <w:t>vetor.length</w:t>
             </w:r>
             <w:proofErr w:type="spellEnd"/>
             <w:r>
@@ -4168,69 +4447,203 @@
                 <w:rFonts w:ascii="Consolas" w:eastAsia="Consolas" w:hAnsi="Consolas" w:cs="Consolas"/>
                 <w:color w:val="008000"/>
               </w:rPr>
-              <w:t>// Enquanto o elemento no in</w:t>
+              <w:t xml:space="preserve">// Enquanto o </w:t>
             </w:r>
             <w:r>
               <w:rPr>
                 <w:rFonts w:ascii="Consolas" w:eastAsia="Consolas" w:hAnsi="Consolas" w:cs="Consolas"/>
                 <w:color w:val="008000"/>
               </w:rPr>
-              <w:t>í</w:t>
+              <w:t>índice inicial for menor que o final, faça</w:t>
+            </w:r>
+          </w:p>
+          <w:p>
+            <w:pPr>
+              <w:shd w:val="clear" w:color="auto" w:fill="FFFFFF"/>
+              <w:spacing w:after="0"/>
+              <w:rPr>
+                <w:rFonts w:ascii="Consolas" w:eastAsia="Consolas" w:hAnsi="Consolas" w:cs="Consolas"/>
+                <w:color w:val="000000"/>
+              </w:rPr>
+            </w:pPr>
+            <w:r>
+              <w:rPr>
+                <w:rFonts w:ascii="Consolas" w:eastAsia="Consolas" w:hAnsi="Consolas" w:cs="Consolas"/>
+                <w:color w:val="000000"/>
+              </w:rPr>
+              <w:t xml:space="preserve">    </w:t>
+            </w:r>
+            <w:proofErr w:type="spellStart"/>
+            <w:r>
+              <w:rPr>
+                <w:rFonts w:ascii="Consolas" w:eastAsia="Consolas" w:hAnsi="Consolas" w:cs="Consolas"/>
+                <w:color w:val="0000FF"/>
+              </w:rPr>
+              <w:t>while</w:t>
+            </w:r>
+            <w:proofErr w:type="spellEnd"/>
+            <w:r>
+              <w:rPr>
+                <w:rFonts w:ascii="Consolas" w:eastAsia="Consolas" w:hAnsi="Consolas" w:cs="Consolas"/>
+                <w:color w:val="000000"/>
+              </w:rPr>
+              <w:t xml:space="preserve"> (inicio &lt;= fim) {</w:t>
+            </w:r>
+          </w:p>
+          <w:p>
+            <w:pPr>
+              <w:shd w:val="clear" w:color="auto" w:fill="FFFFFF"/>
+              <w:spacing w:after="0"/>
+              <w:rPr>
+                <w:rFonts w:ascii="Consolas" w:eastAsia="Consolas" w:hAnsi="Consolas" w:cs="Consolas"/>
+                <w:color w:val="000000"/>
+              </w:rPr>
+            </w:pPr>
+            <w:r>
+              <w:rPr>
+                <w:rFonts w:ascii="Consolas" w:eastAsia="Consolas" w:hAnsi="Consolas" w:cs="Consolas"/>
+                <w:color w:val="000000"/>
+              </w:rPr>
+              <w:t xml:space="preserve">        </w:t>
+            </w:r>
+            <w:proofErr w:type="spellStart"/>
+            <w:r>
+              <w:rPr>
+                <w:rFonts w:ascii="Consolas" w:eastAsia="Consolas" w:hAnsi="Consolas" w:cs="Consolas"/>
+                <w:color w:val="0000FF"/>
+              </w:rPr>
+              <w:t>int</w:t>
+            </w:r>
+            <w:proofErr w:type="spellEnd"/>
+            <w:r>
+              <w:rPr>
+                <w:rFonts w:ascii="Consolas" w:eastAsia="Consolas" w:hAnsi="Consolas" w:cs="Consolas"/>
+                <w:color w:val="000000"/>
+              </w:rPr>
+              <w:t xml:space="preserve"> meio = (inicio + fim) / </w:t>
+            </w:r>
+            <w:r>
+              <w:rPr>
+                <w:rFonts w:ascii="Consolas" w:eastAsia="Consolas" w:hAnsi="Consolas" w:cs="Consolas"/>
+                <w:color w:val="098658"/>
+              </w:rPr>
+              <w:t>2</w:t>
+            </w:r>
+            <w:r>
+              <w:rPr>
+                <w:rFonts w:ascii="Consolas" w:eastAsia="Consolas" w:hAnsi="Consolas" w:cs="Consolas"/>
+                <w:color w:val="000000"/>
+              </w:rPr>
+              <w:t>;</w:t>
+            </w:r>
+            <w:r>
+              <w:rPr>
+                <w:rFonts w:ascii="Consolas" w:eastAsia="Consolas" w:hAnsi="Consolas" w:cs="Consolas"/>
+                <w:color w:val="000000"/>
+              </w:rPr>
+              <w:t xml:space="preserve"> </w:t>
             </w:r>
             <w:r>
               <w:rPr>
                 <w:rFonts w:ascii="Consolas" w:eastAsia="Consolas" w:hAnsi="Consolas" w:cs="Consolas"/>
                 <w:color w:val="008000"/>
               </w:rPr>
-              <w:t>c</w:t>
+              <w:t>// calcula o elemento central</w:t>
+            </w:r>
+          </w:p>
+          <w:p>
+            <w:pPr>
+              <w:shd w:val="clear" w:color="auto" w:fill="FFFFFF"/>
+              <w:spacing w:after="0"/>
+              <w:rPr>
+                <w:rFonts w:ascii="Consolas" w:eastAsia="Consolas" w:hAnsi="Consolas" w:cs="Consolas"/>
+                <w:color w:val="000000"/>
+              </w:rPr>
+            </w:pPr>
+            <w:r>
+              <w:rPr>
+                <w:rFonts w:ascii="Consolas" w:eastAsia="Consolas" w:hAnsi="Consolas" w:cs="Consolas"/>
+                <w:color w:val="000000"/>
+              </w:rPr>
+              <w:t xml:space="preserve">        </w:t>
+            </w:r>
+          </w:p>
+          <w:p>
+            <w:pPr>
+              <w:shd w:val="clear" w:color="auto" w:fill="FFFFFF"/>
+              <w:spacing w:after="0"/>
+              <w:rPr>
+                <w:rFonts w:ascii="Consolas" w:eastAsia="Consolas" w:hAnsi="Consolas" w:cs="Consolas"/>
+                <w:color w:val="000000"/>
+              </w:rPr>
+            </w:pPr>
+            <w:r>
+              <w:rPr>
+                <w:rFonts w:ascii="Consolas" w:eastAsia="Consolas" w:hAnsi="Consolas" w:cs="Consolas"/>
+                <w:color w:val="000000"/>
+              </w:rPr>
+              <w:t xml:space="preserve">        </w:t>
             </w:r>
             <w:r>
               <w:rPr>
                 <w:rFonts w:ascii="Consolas" w:eastAsia="Consolas" w:hAnsi="Consolas" w:cs="Consolas"/>
                 <w:color w:val="008000"/>
               </w:rPr>
-              <w:t>io do vetor for menor ou igual</w:t>
-            </w:r>
-          </w:p>
-          <w:p>
-            <w:pPr>
-              <w:shd w:val="clear" w:color="auto" w:fill="FFFFFF"/>
-              <w:spacing w:after="0"/>
-              <w:rPr>
-                <w:rFonts w:ascii="Consolas" w:eastAsia="Consolas" w:hAnsi="Consolas" w:cs="Consolas"/>
-                <w:color w:val="000000"/>
-              </w:rPr>
-            </w:pPr>
-            <w:r>
-              <w:rPr>
-                <w:rFonts w:ascii="Consolas" w:eastAsia="Consolas" w:hAnsi="Consolas" w:cs="Consolas"/>
-                <w:color w:val="000000"/>
-              </w:rPr>
-              <w:t xml:space="preserve">    </w:t>
-            </w:r>
+              <w:t xml:space="preserve">// Se o </w:t>
+            </w:r>
+            <w:proofErr w:type="spellStart"/>
             <w:r>
               <w:rPr>
                 <w:rFonts w:ascii="Consolas" w:eastAsia="Consolas" w:hAnsi="Consolas" w:cs="Consolas"/>
                 <w:color w:val="008000"/>
               </w:rPr>
-              <w:t>// ao elemento no final do vetor, faça</w:t>
-            </w:r>
-          </w:p>
-          <w:p>
-            <w:pPr>
-              <w:shd w:val="clear" w:color="auto" w:fill="FFFFFF"/>
-              <w:spacing w:after="0"/>
-              <w:rPr>
-                <w:rFonts w:ascii="Consolas" w:eastAsia="Consolas" w:hAnsi="Consolas" w:cs="Consolas"/>
-                <w:color w:val="000000"/>
-              </w:rPr>
-            </w:pPr>
-            <w:r>
-              <w:rPr>
-                <w:rFonts w:ascii="Consolas" w:eastAsia="Consolas" w:hAnsi="Consolas" w:cs="Consolas"/>
-                <w:color w:val="000000"/>
-              </w:rPr>
-              <w:t xml:space="preserve">    </w:t>
+              <w:t>valorPesquisado</w:t>
+            </w:r>
+            <w:proofErr w:type="spellEnd"/>
+            <w:r>
+              <w:rPr>
+                <w:rFonts w:ascii="Consolas" w:eastAsia="Consolas" w:hAnsi="Consolas" w:cs="Consolas"/>
+                <w:color w:val="008000"/>
+              </w:rPr>
+              <w:t xml:space="preserve"> estiver em v</w:t>
+            </w:r>
+            <w:r>
+              <w:rPr>
+                <w:rFonts w:ascii="Consolas" w:eastAsia="Consolas" w:hAnsi="Consolas" w:cs="Consolas"/>
+                <w:color w:val="008000"/>
+              </w:rPr>
+              <w:t>etor</w:t>
+            </w:r>
+            <w:r>
+              <w:rPr>
+                <w:rFonts w:ascii="Consolas" w:eastAsia="Consolas" w:hAnsi="Consolas" w:cs="Consolas"/>
+                <w:color w:val="008000"/>
+              </w:rPr>
+              <w:t xml:space="preserve">[meio], retorna o </w:t>
+            </w:r>
+            <w:r>
+              <w:rPr>
+                <w:rFonts w:ascii="Consolas" w:eastAsia="Consolas" w:hAnsi="Consolas" w:cs="Consolas"/>
+                <w:color w:val="008000"/>
+              </w:rPr>
+              <w:t>índice</w:t>
+            </w:r>
+          </w:p>
+          <w:p>
+            <w:pPr>
+              <w:shd w:val="clear" w:color="auto" w:fill="FFFFFF"/>
+              <w:spacing w:after="0"/>
+              <w:rPr>
+                <w:rFonts w:ascii="Consolas" w:eastAsia="Consolas" w:hAnsi="Consolas" w:cs="Consolas"/>
+                <w:color w:val="000000"/>
+              </w:rPr>
+            </w:pPr>
+            <w:r>
+              <w:rPr>
+                <w:rFonts w:ascii="Consolas" w:eastAsia="Consolas" w:hAnsi="Consolas" w:cs="Consolas"/>
+                <w:color w:val="000000"/>
+              </w:rPr>
+              <w:t xml:space="preserve">        </w:t>
             </w:r>
             <w:proofErr w:type="spellStart"/>
             <w:r>
@@ -4238,15 +4651,108 @@
                 <w:rFonts w:ascii="Consolas" w:eastAsia="Consolas" w:hAnsi="Consolas" w:cs="Consolas"/>
                 <w:color w:val="0000FF"/>
               </w:rPr>
-              <w:t>while</w:t>
-            </w:r>
-            <w:proofErr w:type="spellEnd"/>
-            <w:r>
-              <w:rPr>
-                <w:rFonts w:ascii="Consolas" w:eastAsia="Consolas" w:hAnsi="Consolas" w:cs="Consolas"/>
-                <w:color w:val="000000"/>
-              </w:rPr>
-              <w:t xml:space="preserve"> (inicio &lt;= fim) {</w:t>
+              <w:t>if</w:t>
+            </w:r>
+            <w:proofErr w:type="spellEnd"/>
+            <w:r>
+              <w:rPr>
+                <w:rFonts w:ascii="Consolas" w:eastAsia="Consolas" w:hAnsi="Consolas" w:cs="Consolas"/>
+                <w:color w:val="000000"/>
+              </w:rPr>
+              <w:t xml:space="preserve"> (v</w:t>
+            </w:r>
+            <w:r>
+              <w:rPr>
+                <w:rFonts w:ascii="Consolas" w:eastAsia="Consolas" w:hAnsi="Consolas" w:cs="Consolas"/>
+                <w:color w:val="000000"/>
+              </w:rPr>
+              <w:t>etor</w:t>
+            </w:r>
+            <w:r>
+              <w:rPr>
+                <w:rFonts w:ascii="Consolas" w:eastAsia="Consolas" w:hAnsi="Consolas" w:cs="Consolas"/>
+                <w:color w:val="000000"/>
+              </w:rPr>
+              <w:t xml:space="preserve">[meio] == </w:t>
+            </w:r>
+            <w:proofErr w:type="spellStart"/>
+            <w:r>
+              <w:rPr>
+                <w:rFonts w:ascii="Consolas" w:eastAsia="Consolas" w:hAnsi="Consolas" w:cs="Consolas"/>
+                <w:color w:val="000000"/>
+              </w:rPr>
+              <w:t>valorPesquisado</w:t>
+            </w:r>
+            <w:proofErr w:type="spellEnd"/>
+            <w:r>
+              <w:rPr>
+                <w:rFonts w:ascii="Consolas" w:eastAsia="Consolas" w:hAnsi="Consolas" w:cs="Consolas"/>
+                <w:color w:val="000000"/>
+              </w:rPr>
+              <w:t>) {</w:t>
+            </w:r>
+          </w:p>
+          <w:p>
+            <w:pPr>
+              <w:shd w:val="clear" w:color="auto" w:fill="FFFFFF"/>
+              <w:spacing w:after="0"/>
+              <w:rPr>
+                <w:rFonts w:ascii="Consolas" w:eastAsia="Consolas" w:hAnsi="Consolas" w:cs="Consolas"/>
+                <w:color w:val="000000"/>
+              </w:rPr>
+            </w:pPr>
+            <w:r>
+              <w:rPr>
+                <w:rFonts w:ascii="Consolas" w:eastAsia="Consolas" w:hAnsi="Consolas" w:cs="Consolas"/>
+                <w:color w:val="000000"/>
+              </w:rPr>
+              <w:t xml:space="preserve">            </w:t>
+            </w:r>
+            <w:proofErr w:type="spellStart"/>
+            <w:r>
+              <w:rPr>
+                <w:rFonts w:ascii="Consolas" w:eastAsia="Consolas" w:hAnsi="Consolas" w:cs="Consolas"/>
+                <w:color w:val="0000FF"/>
+              </w:rPr>
+              <w:t>return</w:t>
+            </w:r>
+            <w:proofErr w:type="spellEnd"/>
+            <w:r>
+              <w:rPr>
+                <w:rFonts w:ascii="Consolas" w:eastAsia="Consolas" w:hAnsi="Consolas" w:cs="Consolas"/>
+                <w:color w:val="000000"/>
+              </w:rPr>
+              <w:t xml:space="preserve"> </w:t>
+            </w:r>
+            <w:r>
+              <w:rPr>
+                <w:rFonts w:ascii="Consolas" w:eastAsia="Consolas" w:hAnsi="Consolas" w:cs="Consolas"/>
+              </w:rPr>
+              <w:t>meio</w:t>
+            </w:r>
+            <w:r>
+              <w:rPr>
+                <w:rFonts w:ascii="Consolas" w:eastAsia="Consolas" w:hAnsi="Consolas" w:cs="Consolas"/>
+                <w:color w:val="000000"/>
+              </w:rPr>
+              <w:t>;</w:t>
+            </w:r>
+          </w:p>
+          <w:p>
+            <w:pPr>
+              <w:shd w:val="clear" w:color="auto" w:fill="FFFFFF"/>
+              <w:spacing w:after="0"/>
+              <w:rPr>
+                <w:rFonts w:ascii="Consolas" w:eastAsia="Consolas" w:hAnsi="Consolas" w:cs="Consolas"/>
+                <w:color w:val="000000"/>
+              </w:rPr>
+            </w:pPr>
+            <w:r>
+              <w:rPr>
+                <w:rFonts w:ascii="Consolas" w:eastAsia="Consolas" w:hAnsi="Consolas" w:cs="Consolas"/>
+                <w:color w:val="000000"/>
+              </w:rPr>
+              <w:t>        }</w:t>
             </w:r>
           </w:p>
           <w:p>
@@ -4265,28 +4771,214 @@
               </w:rPr>
               <w:t xml:space="preserve">        </w:t>
             </w:r>
+          </w:p>
+          <w:p>
+            <w:pPr>
+              <w:shd w:val="clear" w:color="auto" w:fill="FFFFFF"/>
+              <w:spacing w:after="0"/>
+              <w:rPr>
+                <w:rFonts w:ascii="Consolas" w:eastAsia="Consolas" w:hAnsi="Consolas" w:cs="Consolas"/>
+                <w:color w:val="000000"/>
+              </w:rPr>
+            </w:pPr>
+            <w:r>
+              <w:rPr>
+                <w:rFonts w:ascii="Consolas" w:eastAsia="Consolas" w:hAnsi="Consolas" w:cs="Consolas"/>
+                <w:color w:val="000000"/>
+              </w:rPr>
+              <w:t xml:space="preserve">        </w:t>
+            </w:r>
+            <w:r>
+              <w:rPr>
+                <w:rFonts w:ascii="Consolas" w:eastAsia="Consolas" w:hAnsi="Consolas" w:cs="Consolas"/>
+                <w:color w:val="008000"/>
+              </w:rPr>
+              <w:t xml:space="preserve">// Se </w:t>
+            </w:r>
+            <w:proofErr w:type="spellStart"/>
+            <w:r>
+              <w:rPr>
+                <w:rFonts w:ascii="Consolas" w:eastAsia="Consolas" w:hAnsi="Consolas" w:cs="Consolas"/>
+                <w:color w:val="008000"/>
+              </w:rPr>
+              <w:t>valorPesquisado</w:t>
+            </w:r>
+            <w:proofErr w:type="spellEnd"/>
+            <w:r>
+              <w:rPr>
+                <w:rFonts w:ascii="Consolas" w:eastAsia="Consolas" w:hAnsi="Consolas" w:cs="Consolas"/>
+                <w:color w:val="008000"/>
+              </w:rPr>
+              <w:t xml:space="preserve"> &gt; v</w:t>
+            </w:r>
+            <w:r>
+              <w:rPr>
+                <w:rFonts w:ascii="Consolas" w:eastAsia="Consolas" w:hAnsi="Consolas" w:cs="Consolas"/>
+                <w:color w:val="008000"/>
+              </w:rPr>
+              <w:t>etor</w:t>
+            </w:r>
+            <w:r>
+              <w:rPr>
+                <w:rFonts w:ascii="Consolas" w:eastAsia="Consolas" w:hAnsi="Consolas" w:cs="Consolas"/>
+                <w:color w:val="008000"/>
+              </w:rPr>
+              <w:t>[meio], descarta a metade esquerda</w:t>
+            </w:r>
+          </w:p>
+          <w:p>
+            <w:pPr>
+              <w:shd w:val="clear" w:color="auto" w:fill="FFFFFF"/>
+              <w:spacing w:after="0"/>
+              <w:rPr>
+                <w:rFonts w:ascii="Consolas" w:eastAsia="Consolas" w:hAnsi="Consolas" w:cs="Consolas"/>
+                <w:color w:val="000000"/>
+              </w:rPr>
+            </w:pPr>
+            <w:r>
+              <w:rPr>
+                <w:rFonts w:ascii="Consolas" w:eastAsia="Consolas" w:hAnsi="Consolas" w:cs="Consolas"/>
+                <w:color w:val="000000"/>
+              </w:rPr>
+              <w:t xml:space="preserve">        </w:t>
+            </w:r>
+            <w:r>
+              <w:rPr>
+                <w:rFonts w:ascii="Consolas" w:eastAsia="Consolas" w:hAnsi="Consolas" w:cs="Consolas"/>
+                <w:color w:val="008000"/>
+              </w:rPr>
+              <w:t xml:space="preserve">// </w:t>
+            </w:r>
+            <w:r>
+              <w:rPr>
+                <w:rFonts w:ascii="Consolas" w:eastAsia="Consolas" w:hAnsi="Consolas" w:cs="Consolas"/>
+                <w:color w:val="008000"/>
+              </w:rPr>
+              <w:t xml:space="preserve">e </w:t>
+            </w:r>
+            <w:r>
+              <w:rPr>
+                <w:rFonts w:ascii="Consolas" w:eastAsia="Consolas" w:hAnsi="Consolas" w:cs="Consolas"/>
+                <w:color w:val="008000"/>
+              </w:rPr>
+              <w:t xml:space="preserve">atualiza </w:t>
+            </w:r>
+            <w:r>
+              <w:rPr>
+                <w:rFonts w:ascii="Consolas" w:eastAsia="Consolas" w:hAnsi="Consolas" w:cs="Consolas"/>
+                <w:color w:val="008000"/>
+              </w:rPr>
+              <w:t>o índice inicial</w:t>
+            </w:r>
+            <w:r>
+              <w:rPr>
+                <w:rFonts w:ascii="Consolas" w:eastAsia="Consolas" w:hAnsi="Consolas" w:cs="Consolas"/>
+                <w:color w:val="008000"/>
+              </w:rPr>
+              <w:t xml:space="preserve"> do vetor</w:t>
+            </w:r>
+          </w:p>
+          <w:p>
+            <w:pPr>
+              <w:shd w:val="clear" w:color="auto" w:fill="FFFFFF"/>
+              <w:spacing w:after="0"/>
+              <w:rPr>
+                <w:rFonts w:ascii="Consolas" w:eastAsia="Consolas" w:hAnsi="Consolas" w:cs="Consolas"/>
+                <w:color w:val="000000"/>
+              </w:rPr>
+            </w:pPr>
+            <w:r>
+              <w:rPr>
+                <w:rFonts w:ascii="Consolas" w:eastAsia="Consolas" w:hAnsi="Consolas" w:cs="Consolas"/>
+                <w:color w:val="000000"/>
+              </w:rPr>
+              <w:t xml:space="preserve">        </w:t>
+            </w:r>
             <w:proofErr w:type="spellStart"/>
             <w:r>
               <w:rPr>
                 <w:rFonts w:ascii="Consolas" w:eastAsia="Consolas" w:hAnsi="Consolas" w:cs="Consolas"/>
                 <w:color w:val="0000FF"/>
               </w:rPr>
-              <w:t>int</w:t>
-            </w:r>
-            <w:proofErr w:type="spellEnd"/>
-            <w:r>
-              <w:rPr>
-                <w:rFonts w:ascii="Consolas" w:eastAsia="Consolas" w:hAnsi="Consolas" w:cs="Consolas"/>
-                <w:color w:val="000000"/>
-              </w:rPr>
-              <w:t xml:space="preserve"> meio = (inicio + fim) / </w:t>
+              <w:t>if</w:t>
+            </w:r>
+            <w:proofErr w:type="spellEnd"/>
+            <w:r>
+              <w:rPr>
+                <w:rFonts w:ascii="Consolas" w:eastAsia="Consolas" w:hAnsi="Consolas" w:cs="Consolas"/>
+                <w:color w:val="000000"/>
+              </w:rPr>
+              <w:t xml:space="preserve"> (</w:t>
+            </w:r>
+            <w:proofErr w:type="spellStart"/>
+            <w:r>
+              <w:rPr>
+                <w:rFonts w:ascii="Consolas" w:eastAsia="Consolas" w:hAnsi="Consolas" w:cs="Consolas"/>
+                <w:color w:val="000000"/>
+              </w:rPr>
+              <w:t>valorPesquisado</w:t>
+            </w:r>
+            <w:proofErr w:type="spellEnd"/>
+            <w:r>
+              <w:rPr>
+                <w:rFonts w:ascii="Consolas" w:eastAsia="Consolas" w:hAnsi="Consolas" w:cs="Consolas"/>
+                <w:color w:val="000000"/>
+              </w:rPr>
+              <w:t xml:space="preserve"> &gt; v</w:t>
+            </w:r>
+            <w:r>
+              <w:rPr>
+                <w:rFonts w:ascii="Consolas" w:eastAsia="Consolas" w:hAnsi="Consolas" w:cs="Consolas"/>
+                <w:color w:val="000000"/>
+              </w:rPr>
+              <w:t>etor</w:t>
+            </w:r>
+            <w:r>
+              <w:rPr>
+                <w:rFonts w:ascii="Consolas" w:eastAsia="Consolas" w:hAnsi="Consolas" w:cs="Consolas"/>
+                <w:color w:val="000000"/>
+              </w:rPr>
+              <w:t>[meio]) {</w:t>
+            </w:r>
+          </w:p>
+          <w:p>
+            <w:pPr>
+              <w:shd w:val="clear" w:color="auto" w:fill="FFFFFF"/>
+              <w:spacing w:after="0"/>
+              <w:rPr>
+                <w:rFonts w:ascii="Consolas" w:eastAsia="Consolas" w:hAnsi="Consolas" w:cs="Consolas"/>
+                <w:color w:val="000000"/>
+              </w:rPr>
+            </w:pPr>
+            <w:r>
+              <w:rPr>
+                <w:rFonts w:ascii="Consolas" w:eastAsia="Consolas" w:hAnsi="Consolas" w:cs="Consolas"/>
+                <w:color w:val="000000"/>
+              </w:rPr>
+              <w:t xml:space="preserve">            </w:t>
+            </w:r>
+            <w:proofErr w:type="spellStart"/>
+            <w:r>
+              <w:rPr>
+                <w:rFonts w:ascii="Consolas" w:eastAsia="Consolas" w:hAnsi="Consolas" w:cs="Consolas"/>
+                <w:color w:val="000000"/>
+              </w:rPr>
+              <w:t>inicio</w:t>
+            </w:r>
+            <w:proofErr w:type="spellEnd"/>
+            <w:r>
+              <w:rPr>
+                <w:rFonts w:ascii="Consolas" w:eastAsia="Consolas" w:hAnsi="Consolas" w:cs="Consolas"/>
+                <w:color w:val="000000"/>
+              </w:rPr>
+              <w:t xml:space="preserve"> = meio + </w:t>
             </w:r>
             <w:r>
               <w:rPr>
                 <w:rFonts w:ascii="Consolas" w:eastAsia="Consolas" w:hAnsi="Consolas" w:cs="Consolas"/>
                 <w:color w:val="098658"/>
               </w:rPr>
-              <w:t>2</w:t>
+              <w:t>1</w:t>
             </w:r>
             <w:r>
               <w:rPr>
@@ -4295,18 +4987,99 @@
               </w:rPr>
               <w:t>;</w:t>
             </w:r>
-            <w:r>
-              <w:rPr>
-                <w:rFonts w:ascii="Consolas" w:eastAsia="Consolas" w:hAnsi="Consolas" w:cs="Consolas"/>
-                <w:color w:val="000000"/>
-              </w:rPr>
-              <w:t xml:space="preserve"> </w:t>
+          </w:p>
+          <w:p>
+            <w:pPr>
+              <w:shd w:val="clear" w:color="auto" w:fill="FFFFFF"/>
+              <w:spacing w:after="0"/>
+              <w:rPr>
+                <w:rFonts w:ascii="Consolas" w:eastAsia="Consolas" w:hAnsi="Consolas" w:cs="Consolas"/>
+                <w:color w:val="000000"/>
+              </w:rPr>
+            </w:pPr>
+            <w:r>
+              <w:rPr>
+                <w:rFonts w:ascii="Consolas" w:eastAsia="Consolas" w:hAnsi="Consolas" w:cs="Consolas"/>
+                <w:color w:val="000000"/>
+              </w:rPr>
+              <w:t xml:space="preserve">        } </w:t>
+            </w:r>
+          </w:p>
+          <w:p>
+            <w:pPr>
+              <w:shd w:val="clear" w:color="auto" w:fill="FFFFFF"/>
+              <w:spacing w:after="0"/>
+              <w:rPr>
+                <w:rFonts w:ascii="Consolas" w:eastAsia="Consolas" w:hAnsi="Consolas" w:cs="Consolas"/>
+                <w:color w:val="000000"/>
+              </w:rPr>
+            </w:pPr>
+            <w:r>
+              <w:rPr>
+                <w:rFonts w:ascii="Consolas" w:eastAsia="Consolas" w:hAnsi="Consolas" w:cs="Consolas"/>
+                <w:color w:val="000000"/>
+              </w:rPr>
+              <w:t xml:space="preserve">        </w:t>
             </w:r>
             <w:r>
               <w:rPr>
                 <w:rFonts w:ascii="Consolas" w:eastAsia="Consolas" w:hAnsi="Consolas" w:cs="Consolas"/>
                 <w:color w:val="008000"/>
               </w:rPr>
+              <w:t xml:space="preserve">// Se </w:t>
+            </w:r>
+            <w:proofErr w:type="spellStart"/>
+            <w:r>
+              <w:rPr>
+                <w:rFonts w:ascii="Consolas" w:eastAsia="Consolas" w:hAnsi="Consolas" w:cs="Consolas"/>
+                <w:color w:val="008000"/>
+              </w:rPr>
+              <w:t>valorPesquisado</w:t>
+            </w:r>
+            <w:proofErr w:type="spellEnd"/>
+            <w:r>
+              <w:rPr>
+                <w:rFonts w:ascii="Consolas" w:eastAsia="Consolas" w:hAnsi="Consolas" w:cs="Consolas"/>
+                <w:color w:val="008000"/>
+              </w:rPr>
+              <w:t xml:space="preserve"> &lt;= v</w:t>
+            </w:r>
+            <w:r>
+              <w:rPr>
+                <w:rFonts w:ascii="Consolas" w:eastAsia="Consolas" w:hAnsi="Consolas" w:cs="Consolas"/>
+                <w:color w:val="008000"/>
+              </w:rPr>
+              <w:t>etor</w:t>
+            </w:r>
+            <w:r>
+              <w:rPr>
+                <w:rFonts w:ascii="Consolas" w:eastAsia="Consolas" w:hAnsi="Consolas" w:cs="Consolas"/>
+                <w:color w:val="008000"/>
+              </w:rPr>
+              <w:t>[meio], descarta a metade direita</w:t>
+            </w:r>
+          </w:p>
+          <w:p>
+            <w:pPr>
+              <w:shd w:val="clear" w:color="auto" w:fill="FFFFFF"/>
+              <w:spacing w:after="0"/>
+              <w:rPr>
+                <w:rFonts w:ascii="Consolas" w:eastAsia="Consolas" w:hAnsi="Consolas" w:cs="Consolas"/>
+                <w:color w:val="000000"/>
+              </w:rPr>
+            </w:pPr>
+            <w:r>
+              <w:rPr>
+                <w:rFonts w:ascii="Consolas" w:eastAsia="Consolas" w:hAnsi="Consolas" w:cs="Consolas"/>
+                <w:color w:val="000000"/>
+              </w:rPr>
+              <w:t xml:space="preserve">        </w:t>
+            </w:r>
+            <w:r>
+              <w:rPr>
+                <w:rFonts w:ascii="Consolas" w:eastAsia="Consolas" w:hAnsi="Consolas" w:cs="Consolas"/>
+                <w:color w:val="008000"/>
+              </w:rPr>
               <w:t xml:space="preserve">// </w:t>
             </w:r>
             <w:r>
@@ -4314,7 +5087,28 @@
                 <w:rFonts w:ascii="Consolas" w:eastAsia="Consolas" w:hAnsi="Consolas" w:cs="Consolas"/>
                 <w:color w:val="008000"/>
               </w:rPr>
-              <w:t>calcula o elemento central</w:t>
+              <w:t>e a</w:t>
+            </w:r>
+            <w:r>
+              <w:rPr>
+                <w:rFonts w:ascii="Consolas" w:eastAsia="Consolas" w:hAnsi="Consolas" w:cs="Consolas"/>
+                <w:color w:val="008000"/>
+              </w:rPr>
+              <w:t xml:space="preserve">tualiza </w:t>
+            </w:r>
+            <w:r>
+              <w:rPr>
+                <w:rFonts w:ascii="Consolas" w:eastAsia="Consolas" w:hAnsi="Consolas" w:cs="Consolas"/>
+                <w:color w:val="008000"/>
+              </w:rPr>
+              <w:t>o índice</w:t>
+            </w:r>
+            <w:r>
+              <w:rPr>
+                <w:rFonts w:ascii="Consolas" w:eastAsia="Consolas" w:hAnsi="Consolas" w:cs="Consolas"/>
+                <w:color w:val="008000"/>
+              </w:rPr>
+              <w:t xml:space="preserve"> final do vetor</w:t>
             </w:r>
           </w:p>
           <w:p>
@@ -4333,136 +5127,46 @@
               </w:rPr>
               <w:t xml:space="preserve">        </w:t>
             </w:r>
-          </w:p>
-          <w:p>
-            <w:pPr>
-              <w:shd w:val="clear" w:color="auto" w:fill="FFFFFF"/>
-              <w:spacing w:after="0"/>
-              <w:rPr>
-                <w:rFonts w:ascii="Consolas" w:eastAsia="Consolas" w:hAnsi="Consolas" w:cs="Consolas"/>
-                <w:color w:val="000000"/>
-              </w:rPr>
-            </w:pPr>
-            <w:r>
-              <w:rPr>
-                <w:rFonts w:ascii="Consolas" w:eastAsia="Consolas" w:hAnsi="Consolas" w:cs="Consolas"/>
-                <w:color w:val="000000"/>
-              </w:rPr>
-              <w:t xml:space="preserve">        </w:t>
-            </w:r>
-            <w:r>
-              <w:rPr>
-                <w:rFonts w:ascii="Consolas" w:eastAsia="Consolas" w:hAnsi="Consolas" w:cs="Consolas"/>
-                <w:color w:val="008000"/>
-              </w:rPr>
-              <w:t xml:space="preserve">// Se o </w:t>
-            </w:r>
-            <w:proofErr w:type="spellStart"/>
-            <w:r>
-              <w:rPr>
-                <w:rFonts w:ascii="Consolas" w:eastAsia="Consolas" w:hAnsi="Consolas" w:cs="Consolas"/>
-                <w:color w:val="008000"/>
-              </w:rPr>
-              <w:t>valorPesquisado</w:t>
-            </w:r>
-            <w:proofErr w:type="spellEnd"/>
-            <w:r>
-              <w:rPr>
-                <w:rFonts w:ascii="Consolas" w:eastAsia="Consolas" w:hAnsi="Consolas" w:cs="Consolas"/>
-                <w:color w:val="008000"/>
-              </w:rPr>
-              <w:t xml:space="preserve"> estiver em v[meio], retorna o valor</w:t>
-            </w:r>
-          </w:p>
-          <w:p>
-            <w:pPr>
-              <w:shd w:val="clear" w:color="auto" w:fill="FFFFFF"/>
-              <w:spacing w:after="0"/>
-              <w:rPr>
-                <w:rFonts w:ascii="Consolas" w:eastAsia="Consolas" w:hAnsi="Consolas" w:cs="Consolas"/>
-                <w:color w:val="000000"/>
-              </w:rPr>
-            </w:pPr>
-            <w:r>
-              <w:rPr>
-                <w:rFonts w:ascii="Consolas" w:eastAsia="Consolas" w:hAnsi="Consolas" w:cs="Consolas"/>
-                <w:color w:val="000000"/>
-              </w:rPr>
-              <w:t xml:space="preserve">        </w:t>
-            </w:r>
             <w:proofErr w:type="spellStart"/>
             <w:r>
               <w:rPr>
                 <w:rFonts w:ascii="Consolas" w:eastAsia="Consolas" w:hAnsi="Consolas" w:cs="Consolas"/>
                 <w:color w:val="0000FF"/>
               </w:rPr>
-              <w:t>if</w:t>
-            </w:r>
-            <w:proofErr w:type="spellEnd"/>
-            <w:r>
-              <w:rPr>
-                <w:rFonts w:ascii="Consolas" w:eastAsia="Consolas" w:hAnsi="Consolas" w:cs="Consolas"/>
-                <w:color w:val="000000"/>
-              </w:rPr>
-              <w:t xml:space="preserve"> (v[meio] == </w:t>
-            </w:r>
-            <w:proofErr w:type="spellStart"/>
-            <w:r>
-              <w:rPr>
-                <w:rFonts w:ascii="Consolas" w:eastAsia="Consolas" w:hAnsi="Consolas" w:cs="Consolas"/>
-                <w:color w:val="000000"/>
-              </w:rPr>
-              <w:t>valorPesquisado</w:t>
-            </w:r>
-            <w:proofErr w:type="spellEnd"/>
-            <w:r>
-              <w:rPr>
-                <w:rFonts w:ascii="Consolas" w:eastAsia="Consolas" w:hAnsi="Consolas" w:cs="Consolas"/>
-                <w:color w:val="000000"/>
-              </w:rPr>
-              <w:t>) {</w:t>
-            </w:r>
-          </w:p>
-          <w:p>
-            <w:pPr>
-              <w:shd w:val="clear" w:color="auto" w:fill="FFFFFF"/>
-              <w:spacing w:after="0"/>
-              <w:rPr>
-                <w:rFonts w:ascii="Consolas" w:eastAsia="Consolas" w:hAnsi="Consolas" w:cs="Consolas"/>
-                <w:color w:val="000000"/>
-              </w:rPr>
-            </w:pPr>
-            <w:r>
-              <w:rPr>
-                <w:rFonts w:ascii="Consolas" w:eastAsia="Consolas" w:hAnsi="Consolas" w:cs="Consolas"/>
-                <w:color w:val="000000"/>
-              </w:rPr>
-              <w:t xml:space="preserve">            </w:t>
-            </w:r>
-            <w:proofErr w:type="spellStart"/>
-            <w:r>
-              <w:rPr>
-                <w:rFonts w:ascii="Consolas" w:eastAsia="Consolas" w:hAnsi="Consolas" w:cs="Consolas"/>
-                <w:color w:val="0000FF"/>
-              </w:rPr>
-              <w:t>return</w:t>
-            </w:r>
-            <w:proofErr w:type="spellEnd"/>
-            <w:r>
-              <w:rPr>
-                <w:rFonts w:ascii="Consolas" w:eastAsia="Consolas" w:hAnsi="Consolas" w:cs="Consolas"/>
-                <w:color w:val="000000"/>
-              </w:rPr>
-              <w:t xml:space="preserve"> </w:t>
-            </w:r>
-            <w:proofErr w:type="spellStart"/>
-            <w:r>
-              <w:rPr>
-                <w:rFonts w:ascii="Consolas" w:eastAsia="Consolas" w:hAnsi="Consolas" w:cs="Consolas"/>
-              </w:rPr>
-              <w:t>valorPesquisado</w:t>
-            </w:r>
-            <w:proofErr w:type="spellEnd"/>
+              <w:t>else</w:t>
+            </w:r>
+            <w:proofErr w:type="spellEnd"/>
+            <w:r>
+              <w:rPr>
+                <w:rFonts w:ascii="Consolas" w:eastAsia="Consolas" w:hAnsi="Consolas" w:cs="Consolas"/>
+                <w:color w:val="000000"/>
+              </w:rPr>
+              <w:t xml:space="preserve"> {</w:t>
+            </w:r>
+          </w:p>
+          <w:p>
+            <w:pPr>
+              <w:shd w:val="clear" w:color="auto" w:fill="FFFFFF"/>
+              <w:spacing w:after="0"/>
+              <w:rPr>
+                <w:rFonts w:ascii="Consolas" w:eastAsia="Consolas" w:hAnsi="Consolas" w:cs="Consolas"/>
+                <w:color w:val="000000"/>
+              </w:rPr>
+            </w:pPr>
+            <w:r>
+              <w:rPr>
+                <w:rFonts w:ascii="Consolas" w:eastAsia="Consolas" w:hAnsi="Consolas" w:cs="Consolas"/>
+                <w:color w:val="000000"/>
+              </w:rPr>
+              <w:t xml:space="preserve">            fim = meio - </w:t>
+            </w:r>
+            <w:r>
+              <w:rPr>
+                <w:rFonts w:ascii="Consolas" w:eastAsia="Consolas" w:hAnsi="Consolas" w:cs="Consolas"/>
+                <w:color w:val="098658"/>
+              </w:rPr>
+              <w:t>1</w:t>
+            </w:r>
             <w:r>
               <w:rPr>
                 <w:rFonts w:ascii="Consolas" w:eastAsia="Consolas" w:hAnsi="Consolas" w:cs="Consolas"/>
@@ -4502,402 +5206,7 @@
                 <w:rFonts w:ascii="Consolas" w:eastAsia="Consolas" w:hAnsi="Consolas" w:cs="Consolas"/>
                 <w:color w:val="000000"/>
               </w:rPr>
-              <w:t xml:space="preserve">        </w:t>
-            </w:r>
-          </w:p>
-          <w:p>
-            <w:pPr>
-              <w:shd w:val="clear" w:color="auto" w:fill="FFFFFF"/>
-              <w:spacing w:after="0"/>
-              <w:rPr>
-                <w:rFonts w:ascii="Consolas" w:eastAsia="Consolas" w:hAnsi="Consolas" w:cs="Consolas"/>
-                <w:color w:val="000000"/>
-              </w:rPr>
-            </w:pPr>
-            <w:r>
-              <w:rPr>
-                <w:rFonts w:ascii="Consolas" w:eastAsia="Consolas" w:hAnsi="Consolas" w:cs="Consolas"/>
-                <w:color w:val="000000"/>
-              </w:rPr>
-              <w:t xml:space="preserve">        </w:t>
-            </w:r>
-            <w:r>
-              <w:rPr>
-                <w:rFonts w:ascii="Consolas" w:eastAsia="Consolas" w:hAnsi="Consolas" w:cs="Consolas"/>
-                <w:color w:val="008000"/>
-              </w:rPr>
-              <w:t xml:space="preserve">// Se </w:t>
-            </w:r>
-            <w:proofErr w:type="spellStart"/>
-            <w:r>
-              <w:rPr>
-                <w:rFonts w:ascii="Consolas" w:eastAsia="Consolas" w:hAnsi="Consolas" w:cs="Consolas"/>
-                <w:color w:val="008000"/>
-              </w:rPr>
-              <w:t>valorPesquisado</w:t>
-            </w:r>
-            <w:proofErr w:type="spellEnd"/>
-            <w:r>
-              <w:rPr>
-                <w:rFonts w:ascii="Consolas" w:eastAsia="Consolas" w:hAnsi="Consolas" w:cs="Consolas"/>
-                <w:color w:val="008000"/>
-              </w:rPr>
-              <w:t xml:space="preserve"> &gt; v[meio], descarta a metade esquerda</w:t>
-            </w:r>
-          </w:p>
-          <w:p>
-            <w:pPr>
-              <w:shd w:val="clear" w:color="auto" w:fill="FFFFFF"/>
-              <w:spacing w:after="0"/>
-              <w:rPr>
-                <w:rFonts w:ascii="Consolas" w:eastAsia="Consolas" w:hAnsi="Consolas" w:cs="Consolas"/>
-                <w:color w:val="000000"/>
-              </w:rPr>
-            </w:pPr>
-            <w:r>
-              <w:rPr>
-                <w:rFonts w:ascii="Consolas" w:eastAsia="Consolas" w:hAnsi="Consolas" w:cs="Consolas"/>
-                <w:color w:val="000000"/>
-              </w:rPr>
-              <w:t xml:space="preserve">        </w:t>
-            </w:r>
-            <w:r>
-              <w:rPr>
-                <w:rFonts w:ascii="Consolas" w:eastAsia="Consolas" w:hAnsi="Consolas" w:cs="Consolas"/>
-                <w:color w:val="008000"/>
-              </w:rPr>
-              <w:t xml:space="preserve">// </w:t>
-            </w:r>
-            <w:r>
-              <w:rPr>
-                <w:rFonts w:ascii="Consolas" w:eastAsia="Consolas" w:hAnsi="Consolas" w:cs="Consolas"/>
-                <w:color w:val="008000"/>
-              </w:rPr>
-              <w:t xml:space="preserve">e </w:t>
-            </w:r>
-            <w:r>
-              <w:rPr>
-                <w:rFonts w:ascii="Consolas" w:eastAsia="Consolas" w:hAnsi="Consolas" w:cs="Consolas"/>
-                <w:color w:val="008000"/>
-              </w:rPr>
-              <w:t>atualiza</w:t>
-            </w:r>
-            <w:r>
-              <w:rPr>
-                <w:rFonts w:ascii="Consolas" w:eastAsia="Consolas" w:hAnsi="Consolas" w:cs="Consolas"/>
-                <w:color w:val="008000"/>
-              </w:rPr>
-              <w:t xml:space="preserve"> o valor da posição inicial do vetor</w:t>
-            </w:r>
-          </w:p>
-          <w:p>
-            <w:pPr>
-              <w:shd w:val="clear" w:color="auto" w:fill="FFFFFF"/>
-              <w:spacing w:after="0"/>
-              <w:rPr>
-                <w:rFonts w:ascii="Consolas" w:eastAsia="Consolas" w:hAnsi="Consolas" w:cs="Consolas"/>
-                <w:color w:val="000000"/>
-              </w:rPr>
-            </w:pPr>
-            <w:r>
-              <w:rPr>
-                <w:rFonts w:ascii="Consolas" w:eastAsia="Consolas" w:hAnsi="Consolas" w:cs="Consolas"/>
-                <w:color w:val="000000"/>
-              </w:rPr>
-              <w:t xml:space="preserve">        </w:t>
-            </w:r>
-            <w:proofErr w:type="spellStart"/>
-            <w:r>
-              <w:rPr>
-                <w:rFonts w:ascii="Consolas" w:eastAsia="Consolas" w:hAnsi="Consolas" w:cs="Consolas"/>
-                <w:color w:val="0000FF"/>
-              </w:rPr>
-              <w:t>if</w:t>
-            </w:r>
-            <w:proofErr w:type="spellEnd"/>
-            <w:r>
-              <w:rPr>
-                <w:rFonts w:ascii="Consolas" w:eastAsia="Consolas" w:hAnsi="Consolas" w:cs="Consolas"/>
-                <w:color w:val="000000"/>
-              </w:rPr>
-              <w:t xml:space="preserve"> (</w:t>
-            </w:r>
-            <w:proofErr w:type="spellStart"/>
-            <w:r>
-              <w:rPr>
-                <w:rFonts w:ascii="Consolas" w:eastAsia="Consolas" w:hAnsi="Consolas" w:cs="Consolas"/>
-                <w:color w:val="000000"/>
-              </w:rPr>
-              <w:t>valorPesquisado</w:t>
-            </w:r>
-            <w:proofErr w:type="spellEnd"/>
-            <w:r>
-              <w:rPr>
-                <w:rFonts w:ascii="Consolas" w:eastAsia="Consolas" w:hAnsi="Consolas" w:cs="Consolas"/>
-                <w:color w:val="000000"/>
-              </w:rPr>
-              <w:t xml:space="preserve"> &gt; v[meio]) {</w:t>
-            </w:r>
-          </w:p>
-          <w:p>
-            <w:pPr>
-              <w:shd w:val="clear" w:color="auto" w:fill="FFFFFF"/>
-              <w:spacing w:after="0"/>
-              <w:rPr>
-                <w:rFonts w:ascii="Consolas" w:eastAsia="Consolas" w:hAnsi="Consolas" w:cs="Consolas"/>
-                <w:color w:val="000000"/>
-              </w:rPr>
-            </w:pPr>
-            <w:r>
-              <w:rPr>
-                <w:rFonts w:ascii="Consolas" w:eastAsia="Consolas" w:hAnsi="Consolas" w:cs="Consolas"/>
-                <w:color w:val="000000"/>
-              </w:rPr>
-              <w:t xml:space="preserve">            </w:t>
-            </w:r>
-            <w:proofErr w:type="spellStart"/>
-            <w:r>
-              <w:rPr>
-                <w:rFonts w:ascii="Consolas" w:eastAsia="Consolas" w:hAnsi="Consolas" w:cs="Consolas"/>
-                <w:color w:val="000000"/>
-              </w:rPr>
-              <w:t>inicio</w:t>
-            </w:r>
-            <w:proofErr w:type="spellEnd"/>
-            <w:r>
-              <w:rPr>
-                <w:rFonts w:ascii="Consolas" w:eastAsia="Consolas" w:hAnsi="Consolas" w:cs="Consolas"/>
-                <w:color w:val="000000"/>
-              </w:rPr>
-              <w:t xml:space="preserve"> = meio + </w:t>
-            </w:r>
-            <w:r>
-              <w:rPr>
-                <w:rFonts w:ascii="Consolas" w:eastAsia="Consolas" w:hAnsi="Consolas" w:cs="Consolas"/>
-                <w:color w:val="098658"/>
-              </w:rPr>
-              <w:t>1</w:t>
-            </w:r>
-            <w:r>
-              <w:rPr>
-                <w:rFonts w:ascii="Consolas" w:eastAsia="Consolas" w:hAnsi="Consolas" w:cs="Consolas"/>
-                <w:color w:val="000000"/>
-              </w:rPr>
-              <w:t>;</w:t>
-            </w:r>
-          </w:p>
-          <w:p>
-            <w:pPr>
-              <w:shd w:val="clear" w:color="auto" w:fill="FFFFFF"/>
-              <w:spacing w:after="0"/>
-              <w:rPr>
-                <w:rFonts w:ascii="Consolas" w:eastAsia="Consolas" w:hAnsi="Consolas" w:cs="Consolas"/>
-                <w:color w:val="000000"/>
-              </w:rPr>
-            </w:pPr>
-            <w:r>
-              <w:rPr>
-                <w:rFonts w:ascii="Consolas" w:eastAsia="Consolas" w:hAnsi="Consolas" w:cs="Consolas"/>
-                <w:color w:val="000000"/>
-              </w:rPr>
-              <w:t xml:space="preserve">        } </w:t>
-            </w:r>
-          </w:p>
-          <w:p>
-            <w:pPr>
-              <w:shd w:val="clear" w:color="auto" w:fill="FFFFFF"/>
-              <w:spacing w:after="0"/>
-              <w:rPr>
-                <w:rFonts w:ascii="Consolas" w:eastAsia="Consolas" w:hAnsi="Consolas" w:cs="Consolas"/>
-                <w:color w:val="000000"/>
-              </w:rPr>
-            </w:pPr>
-            <w:r>
-              <w:rPr>
-                <w:rFonts w:ascii="Consolas" w:eastAsia="Consolas" w:hAnsi="Consolas" w:cs="Consolas"/>
-                <w:color w:val="000000"/>
-              </w:rPr>
-              <w:t xml:space="preserve">        </w:t>
-            </w:r>
-            <w:r>
-              <w:rPr>
-                <w:rFonts w:ascii="Consolas" w:eastAsia="Consolas" w:hAnsi="Consolas" w:cs="Consolas"/>
-                <w:color w:val="008000"/>
-              </w:rPr>
-              <w:t xml:space="preserve">// Se </w:t>
-            </w:r>
-            <w:proofErr w:type="spellStart"/>
-            <w:r>
-              <w:rPr>
-                <w:rFonts w:ascii="Consolas" w:eastAsia="Consolas" w:hAnsi="Consolas" w:cs="Consolas"/>
-                <w:color w:val="008000"/>
-              </w:rPr>
-              <w:t>valorPesquisado</w:t>
-            </w:r>
-            <w:proofErr w:type="spellEnd"/>
-            <w:r>
-              <w:rPr>
-                <w:rFonts w:ascii="Consolas" w:eastAsia="Consolas" w:hAnsi="Consolas" w:cs="Consolas"/>
-                <w:color w:val="008000"/>
-              </w:rPr>
-              <w:t xml:space="preserve"> &lt;= v[meio]</w:t>
-            </w:r>
-            <w:r>
-              <w:rPr>
-                <w:rFonts w:ascii="Consolas" w:eastAsia="Consolas" w:hAnsi="Consolas" w:cs="Consolas"/>
-                <w:color w:val="008000"/>
-              </w:rPr>
-              <w:t xml:space="preserve">, descarta a </w:t>
-            </w:r>
-            <w:r>
-              <w:rPr>
-                <w:rFonts w:ascii="Consolas" w:eastAsia="Consolas" w:hAnsi="Consolas" w:cs="Consolas"/>
-                <w:color w:val="008000"/>
-              </w:rPr>
-              <w:t>metade direita</w:t>
-            </w:r>
-          </w:p>
-          <w:p>
-            <w:pPr>
-              <w:shd w:val="clear" w:color="auto" w:fill="FFFFFF"/>
-              <w:spacing w:after="0"/>
-              <w:rPr>
-                <w:rFonts w:ascii="Consolas" w:eastAsia="Consolas" w:hAnsi="Consolas" w:cs="Consolas"/>
-                <w:color w:val="000000"/>
-              </w:rPr>
-            </w:pPr>
-            <w:r>
-              <w:rPr>
-                <w:rFonts w:ascii="Consolas" w:eastAsia="Consolas" w:hAnsi="Consolas" w:cs="Consolas"/>
-                <w:color w:val="000000"/>
-              </w:rPr>
-              <w:t xml:space="preserve">        </w:t>
-            </w:r>
-            <w:r>
-              <w:rPr>
-                <w:rFonts w:ascii="Consolas" w:eastAsia="Consolas" w:hAnsi="Consolas" w:cs="Consolas"/>
-                <w:color w:val="008000"/>
-              </w:rPr>
-              <w:t xml:space="preserve">// </w:t>
-            </w:r>
-            <w:r>
-              <w:rPr>
-                <w:rFonts w:ascii="Consolas" w:eastAsia="Consolas" w:hAnsi="Consolas" w:cs="Consolas"/>
-                <w:color w:val="008000"/>
-              </w:rPr>
-              <w:t>e a</w:t>
-            </w:r>
-            <w:r>
-              <w:rPr>
-                <w:rFonts w:ascii="Consolas" w:eastAsia="Consolas" w:hAnsi="Consolas" w:cs="Consolas"/>
-                <w:color w:val="008000"/>
-              </w:rPr>
-              <w:t>tualiza</w:t>
-            </w:r>
-            <w:r>
-              <w:rPr>
-                <w:rFonts w:ascii="Consolas" w:eastAsia="Consolas" w:hAnsi="Consolas" w:cs="Consolas"/>
-                <w:color w:val="008000"/>
-              </w:rPr>
-              <w:t xml:space="preserve"> o valor da posição final do vetor</w:t>
-            </w:r>
-          </w:p>
-          <w:p>
-            <w:pPr>
-              <w:shd w:val="clear" w:color="auto" w:fill="FFFFFF"/>
-              <w:spacing w:after="0"/>
-              <w:rPr>
-                <w:rFonts w:ascii="Consolas" w:eastAsia="Consolas" w:hAnsi="Consolas" w:cs="Consolas"/>
-                <w:color w:val="000000"/>
-              </w:rPr>
-            </w:pPr>
-            <w:r>
-              <w:rPr>
-                <w:rFonts w:ascii="Consolas" w:eastAsia="Consolas" w:hAnsi="Consolas" w:cs="Consolas"/>
-                <w:color w:val="000000"/>
-              </w:rPr>
-              <w:t xml:space="preserve">        </w:t>
-            </w:r>
-            <w:proofErr w:type="spellStart"/>
-            <w:r>
-              <w:rPr>
-                <w:rFonts w:ascii="Consolas" w:eastAsia="Consolas" w:hAnsi="Consolas" w:cs="Consolas"/>
-                <w:color w:val="0000FF"/>
-              </w:rPr>
-              <w:t>else</w:t>
-            </w:r>
-            <w:proofErr w:type="spellEnd"/>
-            <w:r>
-              <w:rPr>
-                <w:rFonts w:ascii="Consolas" w:eastAsia="Consolas" w:hAnsi="Consolas" w:cs="Consolas"/>
-                <w:color w:val="000000"/>
-              </w:rPr>
-              <w:t xml:space="preserve"> {</w:t>
-            </w:r>
-          </w:p>
-          <w:p>
-            <w:pPr>
-              <w:shd w:val="clear" w:color="auto" w:fill="FFFFFF"/>
-              <w:spacing w:after="0"/>
-              <w:rPr>
-                <w:rFonts w:ascii="Consolas" w:eastAsia="Consolas" w:hAnsi="Consolas" w:cs="Consolas"/>
-                <w:color w:val="000000"/>
-              </w:rPr>
-            </w:pPr>
-            <w:r>
-              <w:rPr>
-                <w:rFonts w:ascii="Consolas" w:eastAsia="Consolas" w:hAnsi="Consolas" w:cs="Consolas"/>
-                <w:color w:val="000000"/>
-              </w:rPr>
-              <w:t xml:space="preserve">            fim = meio - </w:t>
-            </w:r>
-            <w:r>
-              <w:rPr>
-                <w:rFonts w:ascii="Consolas" w:eastAsia="Consolas" w:hAnsi="Consolas" w:cs="Consolas"/>
-                <w:color w:val="098658"/>
-              </w:rPr>
-              <w:t>1</w:t>
-            </w:r>
-            <w:r>
-              <w:rPr>
-                <w:rFonts w:ascii="Consolas" w:eastAsia="Consolas" w:hAnsi="Consolas" w:cs="Consolas"/>
-                <w:color w:val="000000"/>
-              </w:rPr>
-              <w:t>;</w:t>
-            </w:r>
-          </w:p>
-          <w:p>
-            <w:pPr>
-              <w:shd w:val="clear" w:color="auto" w:fill="FFFFFF"/>
-              <w:spacing w:after="0"/>
-              <w:rPr>
-                <w:rFonts w:ascii="Consolas" w:eastAsia="Consolas" w:hAnsi="Consolas" w:cs="Consolas"/>
-                <w:color w:val="000000"/>
-              </w:rPr>
-            </w:pPr>
-            <w:r>
-              <w:rPr>
-                <w:rFonts w:ascii="Consolas" w:eastAsia="Consolas" w:hAnsi="Consolas" w:cs="Consolas"/>
-                <w:color w:val="000000"/>
-              </w:rPr>
               <w:lastRenderedPageBreak/>
-              <w:t>        }</w:t>
-            </w:r>
-          </w:p>
-          <w:p>
-            <w:pPr>
-              <w:shd w:val="clear" w:color="auto" w:fill="FFFFFF"/>
-              <w:spacing w:after="0"/>
-              <w:rPr>
-                <w:rFonts w:ascii="Consolas" w:eastAsia="Consolas" w:hAnsi="Consolas" w:cs="Consolas"/>
-                <w:color w:val="000000"/>
-              </w:rPr>
-            </w:pPr>
-            <w:r>
-              <w:rPr>
-                <w:rFonts w:ascii="Consolas" w:eastAsia="Consolas" w:hAnsi="Consolas" w:cs="Consolas"/>
-                <w:color w:val="000000"/>
-              </w:rPr>
               <w:t>    }</w:t>
             </w:r>
           </w:p>
@@ -5452,6 +5761,7 @@
               <w:rPr>
                 <w:rFonts w:ascii="Consolas" w:eastAsia="Consolas" w:hAnsi="Consolas" w:cs="Consolas"/>
                 <w:color w:val="000000"/>
+                <w:lang w:val="en-US"/>
               </w:rPr>
               <w:t xml:space="preserve">        </w:t>
             </w:r>
@@ -5476,14 +5786,7 @@
                 <w:rFonts w:ascii="Consolas" w:eastAsia="Consolas" w:hAnsi="Consolas" w:cs="Consolas"/>
                 <w:color w:val="000000"/>
               </w:rPr>
-              <w:t xml:space="preserve"> v</w:t>
-            </w:r>
-            <w:r>
-              <w:rPr>
-                <w:rFonts w:ascii="Consolas" w:eastAsia="Consolas" w:hAnsi="Consolas" w:cs="Consolas"/>
-                <w:color w:val="000000"/>
-              </w:rPr>
-              <w:t xml:space="preserve"> = </w:t>
+              <w:t xml:space="preserve"> v = </w:t>
             </w:r>
             <w:r>
               <w:rPr>
@@ -5576,14 +5879,7 @@
                 <w:rFonts w:ascii="Consolas" w:eastAsia="Consolas" w:hAnsi="Consolas" w:cs="Consolas"/>
                 <w:color w:val="000000"/>
               </w:rPr>
-              <w:t>v</w:t>
-            </w:r>
-            <w:r>
-              <w:rPr>
-                <w:rFonts w:ascii="Consolas" w:eastAsia="Consolas" w:hAnsi="Consolas" w:cs="Consolas"/>
-                <w:color w:val="000000"/>
-              </w:rPr>
-              <w:t>.preencheVetor</w:t>
+              <w:t>v.preencheVetor</w:t>
             </w:r>
             <w:proofErr w:type="spellEnd"/>
             <w:r>
@@ -5627,15 +5923,7 @@
                 <w:color w:val="000000"/>
                 <w:lang w:val="en-US"/>
               </w:rPr>
-              <w:t>(v</w:t>
-            </w:r>
-            <w:r>
-              <w:rPr>
-                <w:rFonts w:ascii="Consolas" w:eastAsia="Consolas" w:hAnsi="Consolas" w:cs="Consolas"/>
-                <w:color w:val="000000"/>
-                <w:lang w:val="en-US"/>
-              </w:rPr>
-              <w:t>);</w:t>
+              <w:t>(v);</w:t>
             </w:r>
           </w:p>
           <w:p>
@@ -5731,6 +6019,7 @@
               <w:rPr>
                 <w:rFonts w:ascii="Consolas" w:eastAsia="Consolas" w:hAnsi="Consolas" w:cs="Consolas"/>
                 <w:color w:val="000000"/>
+                <w:lang w:val="en-US"/>
               </w:rPr>
               <w:t xml:space="preserve">        </w:t>
             </w:r>
@@ -6019,14 +6308,39 @@
                 <w:rFonts w:ascii="Consolas" w:eastAsia="Consolas" w:hAnsi="Consolas" w:cs="Consolas"/>
                 <w:color w:val="A31515"/>
               </w:rPr>
-              <w:t xml:space="preserve">"Valor encontrado </w:t>
-            </w:r>
+              <w:t xml:space="preserve">"Valor encontrado na </w:t>
+            </w:r>
+            <w:proofErr w:type="spellStart"/>
             <w:r>
               <w:rPr>
                 <w:rFonts w:ascii="Consolas" w:eastAsia="Consolas" w:hAnsi="Consolas" w:cs="Consolas"/>
                 <w:color w:val="A31515"/>
               </w:rPr>
-              <w:t xml:space="preserve">na posição de </w:t>
+              <w:t>pos</w:t>
+            </w:r>
+            <w:proofErr w:type="spellEnd"/>
+            <w:r>
+              <w:rPr>
+                <w:rFonts w:ascii="Consolas" w:eastAsia="Consolas" w:hAnsi="Consolas" w:cs="Consolas"/>
+                <w:color w:val="A31515"/>
+              </w:rPr>
+              <w:t xml:space="preserve"> </w:t>
+            </w:r>
+            <w:proofErr w:type="spellStart"/>
+            <w:r>
+              <w:rPr>
+                <w:rFonts w:ascii="Consolas" w:eastAsia="Consolas" w:hAnsi="Consolas" w:cs="Consolas"/>
+                <w:color w:val="A31515"/>
+              </w:rPr>
+              <w:t>ição</w:t>
+            </w:r>
+            <w:proofErr w:type="spellEnd"/>
+            <w:r>
+              <w:rPr>
+                <w:rFonts w:ascii="Consolas" w:eastAsia="Consolas" w:hAnsi="Consolas" w:cs="Consolas"/>
+                <w:color w:val="A31515"/>
+              </w:rPr>
+              <w:t xml:space="preserve"> de </w:t>
             </w:r>
             <w:r>
               <w:rPr>
@@ -6549,7 +6863,33 @@
                 <w:color w:val="A31515"/>
                 <w:highlight w:val="yellow"/>
               </w:rPr>
-              <w:t>"Valor encontrado: "</w:t>
+              <w:t>"Valor encontrado</w:t>
+            </w:r>
+            <w:r>
+              <w:rPr>
+                <w:rFonts w:ascii="Consolas" w:eastAsia="Consolas" w:hAnsi="Consolas" w:cs="Consolas"/>
+                <w:color w:val="A31515"/>
+                <w:highlight w:val="yellow"/>
+              </w:rPr>
+              <w:t xml:space="preserve"> na </w:t>
+            </w:r>
+            <w:proofErr w:type="spellStart"/>
+            <w:r>
+              <w:rPr>
+                <w:rFonts w:ascii="Consolas" w:eastAsia="Consolas" w:hAnsi="Consolas" w:cs="Consolas"/>
+                <w:color w:val="A31515"/>
+                <w:highlight w:val="yellow"/>
+              </w:rPr>
+              <w:t>posicao</w:t>
+            </w:r>
+            <w:proofErr w:type="spellEnd"/>
+            <w:r>
+              <w:rPr>
+                <w:rFonts w:ascii="Consolas" w:eastAsia="Consolas" w:hAnsi="Consolas" w:cs="Consolas"/>
+                <w:color w:val="A31515"/>
+                <w:highlight w:val="yellow"/>
+              </w:rPr>
+              <w:t>: "</w:t>
             </w:r>
             <w:r>
               <w:rPr>
@@ -6628,15 +6968,7 @@
                 <w:color w:val="000000"/>
                 <w:highlight w:val="yellow"/>
               </w:rPr>
-              <w:t>     </w:t>
-            </w:r>
-            <w:r>
-              <w:rPr>
-                <w:rFonts w:ascii="Consolas" w:eastAsia="Consolas" w:hAnsi="Consolas" w:cs="Consolas"/>
-                <w:color w:val="000000"/>
-                <w:highlight w:val="yellow"/>
-              </w:rPr>
-              <w:t xml:space="preserve">       </w:t>
+              <w:t xml:space="preserve">            </w:t>
             </w:r>
             <w:proofErr w:type="spellStart"/>
             <w:r>

</xml_diff>

<commit_message>
Fim - aula 04/03 - retomar comparando o tempo de execução de ambos os algoritmos
</commit_message>
<xml_diff>
--- a/t1-sub1-lab/semana04 - buscaBinaria/Apostila - BuscaLinears&BuscaBinaria.docx
+++ b/t1-sub1-lab/semana04 - buscaBinaria/Apostila - BuscaLinears&BuscaBinaria.docx
@@ -3581,18 +3581,8 @@
           <w:sz w:val="26"/>
           <w:szCs w:val="26"/>
         </w:rPr>
-        <w:t xml:space="preserve">cenário </w:t>
-      </w:r>
-      <w:proofErr w:type="gramStart"/>
-      <w:r>
-        <w:rPr>
-          <w:rFonts w:ascii="Arial" w:hAnsi="Arial" w:cs="Arial"/>
-          <w:sz w:val="26"/>
-          <w:szCs w:val="26"/>
-        </w:rPr>
-        <w:t>2</w:t>
-      </w:r>
-      <w:proofErr w:type="gramEnd"/>
+        <w:t>cenário 2</w:t>
+      </w:r>
       <w:r>
         <w:rPr>
           <w:rFonts w:ascii="Arial" w:hAnsi="Arial" w:cs="Arial"/>
@@ -4392,7 +4382,6 @@
               </w:rPr>
               <w:t xml:space="preserve">, fim = </w:t>
             </w:r>
-            <w:proofErr w:type="spellStart"/>
             <w:r>
               <w:rPr>
                 <w:rFonts w:ascii="Consolas" w:eastAsia="Consolas" w:hAnsi="Consolas" w:cs="Consolas"/>
@@ -4400,7 +4389,13 @@
               </w:rPr>
               <w:t>vetor.length</w:t>
             </w:r>
-            <w:proofErr w:type="spellEnd"/>
+            <w:r>
+              <w:rPr>
+                <w:rFonts w:ascii="Consolas" w:eastAsia="Consolas" w:hAnsi="Consolas" w:cs="Consolas"/>
+                <w:color w:val="000000"/>
+              </w:rPr>
+              <w:t>-1</w:t>
+            </w:r>
             <w:r>
               <w:rPr>
                 <w:rFonts w:ascii="Consolas" w:eastAsia="Consolas" w:hAnsi="Consolas" w:cs="Consolas"/>

</xml_diff>